<commit_message>
Rename variables, rephrase report, add execution screenshot
Report keeps only the partition routine as code, adds a terminal-output
figure, and uses numbers from a fresh full benchmark run.

Co-Authored-By: Claude Opus 5.5 <noreply@anthropic.com>
</commit_message>
<xml_diff>
--- a/MSCS532_Assignment2_Report.docx
+++ b/MSCS532_Assignment2_Report.docx
@@ -133,7 +133,7 @@
           <w:b w:val="0"/>
           <w:i w:val="0"/>
         </w:rPr>
-        <w:t xml:space="preserve">Merge Sort and Quick Sort both solve the sorting problem (rearrange </w:t>
+        <w:t xml:space="preserve">Sorting asks for a list of </w:t>
       </w:r>
       <w:r>
         <w:rPr>
@@ -147,7 +147,7 @@
           <w:b w:val="0"/>
           <w:i w:val="0"/>
         </w:rPr>
-        <w:t xml:space="preserve"> keys into nondecreasing order) by divide and conquer, but they place their work in different phases, which leads to different guarantees and different practical behavior.</w:t>
+        <w:t xml:space="preserve"> keys to be put in nondecreasing order. Merge Sort and Quick Sort both handle it with divide and conquer: break the input into smaller pieces, sort the pieces recursively, and assemble the result. They differ in where the effort goes, and that difference shapes both their guarantees and how they perform in practice.</w:t>
       </w:r>
     </w:p>
     <w:p>
@@ -167,7 +167,7 @@
           <w:b w:val="0"/>
           <w:i w:val="0"/>
         </w:rPr>
-        <w:t xml:space="preserve">Merge Sort does trivial work to divide and real work to combine. It (1) divides the array at its midpoint, (2) recursively sorts both halves, and (3) merges the two sorted halves by repeatedly taking the smaller front element (Knuth, 1998). Merging </w:t>
+        <w:t xml:space="preserve">In Merge Sort, splitting is cheap and joining is where the work happens. The algorithm cuts the list at its center, sorts each half by a recursive call, and then merges the two ordered halves by repeatedly moving the smaller of the two leading items into place (Knuth, 1998). A merge of </w:t>
       </w:r>
       <w:r>
         <w:rPr>
@@ -181,7 +181,7 @@
           <w:b w:val="0"/>
           <w:i w:val="0"/>
         </w:rPr>
-        <w:t xml:space="preserve"> elements costs Θ(</w:t>
+        <w:t xml:space="preserve"> items takes Θ(</w:t>
       </w:r>
       <w:r>
         <w:rPr>
@@ -195,7 +195,7 @@
           <w:b w:val="0"/>
           <w:i w:val="0"/>
         </w:rPr>
-        <w:t>), and the division is always even, so the recurrence is the same for every input:</w:t>
+        <w:t>) time and the halves are always equal in size, so every input produces the same recurrence:</w:t>
       </w:r>
     </w:p>
     <w:p>
@@ -226,7 +226,7 @@
           <w:b w:val="0"/>
           <w:i w:val="0"/>
         </w:rPr>
-        <w:t xml:space="preserve"> Here </w:t>
+        <w:t xml:space="preserve"> With </w:t>
       </w:r>
       <w:r>
         <w:rPr>
@@ -240,7 +240,7 @@
           <w:b w:val="0"/>
           <w:i w:val="0"/>
         </w:rPr>
-        <w:t xml:space="preserve"> = 2, </w:t>
+        <w:t xml:space="preserve"> = 2 and </w:t>
       </w:r>
       <w:r>
         <w:rPr>
@@ -254,7 +254,7 @@
           <w:b w:val="0"/>
           <w:i w:val="0"/>
         </w:rPr>
-        <w:t xml:space="preserve"> = 2, and </w:t>
+        <w:t xml:space="preserve"> = 2, the watershed function is </w:t>
       </w:r>
       <w:r>
         <w:rPr>
@@ -289,7 +289,7 @@
           <w:b w:val="0"/>
           <w:i w:val="0"/>
         </w:rPr>
-        <w:t xml:space="preserve">. Since </w:t>
+        <w:t xml:space="preserve">. Because </w:t>
       </w:r>
       <w:r>
         <w:rPr>
@@ -331,7 +331,7 @@
           <w:b w:val="0"/>
           <w:i w:val="0"/>
         </w:rPr>
-        <w:t>) matches this exactly, case 2 applies and T(</w:t>
+        <w:t>) grows at exactly that rate, case 2 gives T(</w:t>
       </w:r>
       <w:r>
         <w:rPr>
@@ -387,7 +387,7 @@
           <w:b w:val="0"/>
           <w:i w:val="0"/>
         </w:rPr>
-        <w:t xml:space="preserve"> The root costs </w:t>
+        <w:t xml:space="preserve"> The top node costs </w:t>
       </w:r>
       <w:r>
         <w:rPr>
@@ -401,7 +401,7 @@
           <w:b w:val="0"/>
           <w:i w:val="0"/>
         </w:rPr>
-        <w:t xml:space="preserve">; level </w:t>
+        <w:t xml:space="preserve">. At depth </w:t>
       </w:r>
       <w:r>
         <w:rPr>
@@ -415,7 +415,7 @@
           <w:b w:val="0"/>
           <w:i w:val="0"/>
         </w:rPr>
-        <w:t xml:space="preserve"> has 2</w:t>
+        <w:t xml:space="preserve"> there are 2</w:t>
       </w:r>
       <w:r>
         <w:rPr>
@@ -429,7 +429,35 @@
           <w:b w:val="0"/>
           <w:i w:val="0"/>
         </w:rPr>
-        <w:t xml:space="preserve"> nodes of cost </w:t>
+        <w:t xml:space="preserve"> subproblems of size </w:t>
+      </w:r>
+      <w:r>
+        <w:rPr>
+          <w:b w:val="0"/>
+          <w:i/>
+        </w:rPr>
+        <w:t>n</w:t>
+      </w:r>
+      <w:r>
+        <w:rPr>
+          <w:b w:val="0"/>
+          <w:i w:val="0"/>
+        </w:rPr>
+        <w:t>/2</w:t>
+      </w:r>
+      <w:r>
+        <w:rPr>
+          <w:i/>
+          <w:vertAlign w:val="superscript"/>
+        </w:rPr>
+        <w:t>i</w:t>
+      </w:r>
+      <w:r>
+        <w:rPr>
+          <w:b w:val="0"/>
+          <w:i w:val="0"/>
+        </w:rPr>
+        <w:t xml:space="preserve">, so each depth contributes </w:t>
       </w:r>
       <w:r>
         <w:rPr>
@@ -443,21 +471,21 @@
           <w:b w:val="0"/>
           <w:i w:val="0"/>
         </w:rPr>
-        <w:t>/2</w:t>
+        <w:t xml:space="preserve"> in total; over lg </w:t>
       </w:r>
       <w:r>
         <w:rPr>
+          <w:b w:val="0"/>
           <w:i/>
-          <w:vertAlign w:val="superscript"/>
         </w:rPr>
-        <w:t>i</w:t>
+        <w:t>n</w:t>
       </w:r>
       <w:r>
         <w:rPr>
           <w:b w:val="0"/>
           <w:i w:val="0"/>
         </w:rPr>
-        <w:t xml:space="preserve">, so every level costs </w:t>
+        <w:t xml:space="preserve"> + 1 depths this sums to </w:t>
       </w:r>
       <w:r>
         <w:rPr>
@@ -471,7 +499,7 @@
           <w:b w:val="0"/>
           <w:i w:val="0"/>
         </w:rPr>
-        <w:t xml:space="preserve">. With lg </w:t>
+        <w:t xml:space="preserve"> lg </w:t>
       </w:r>
       <w:r>
         <w:rPr>
@@ -485,7 +513,7 @@
           <w:b w:val="0"/>
           <w:i w:val="0"/>
         </w:rPr>
-        <w:t xml:space="preserve"> + 1 levels, the total is </w:t>
+        <w:t xml:space="preserve"> + </w:t>
       </w:r>
       <w:r>
         <w:rPr>
@@ -499,7 +527,7 @@
           <w:b w:val="0"/>
           <w:i w:val="0"/>
         </w:rPr>
-        <w:t xml:space="preserve"> lg </w:t>
+        <w:t xml:space="preserve"> = Θ(</w:t>
       </w:r>
       <w:r>
         <w:rPr>
@@ -513,7 +541,175 @@
           <w:b w:val="0"/>
           <w:i w:val="0"/>
         </w:rPr>
-        <w:t xml:space="preserve"> + </w:t>
+        <w:t xml:space="preserve"> lg </w:t>
+      </w:r>
+      <w:r>
+        <w:rPr>
+          <w:b w:val="0"/>
+          <w:i/>
+        </w:rPr>
+        <w:t>n</w:t>
+      </w:r>
+      <w:r>
+        <w:rPr>
+          <w:b w:val="0"/>
+          <w:i w:val="0"/>
+        </w:rPr>
+        <w:t xml:space="preserve">). </w:t>
+      </w:r>
+      <w:r>
+        <w:rPr>
+          <w:b w:val="0"/>
+          <w:i/>
+        </w:rPr>
+        <w:t>Substitution.</w:t>
+      </w:r>
+      <w:r>
+        <w:rPr>
+          <w:b w:val="0"/>
+          <w:i w:val="0"/>
+        </w:rPr>
+        <w:t xml:space="preserve"> Suppose T(</w:t>
+      </w:r>
+      <w:r>
+        <w:rPr>
+          <w:b w:val="0"/>
+          <w:i/>
+        </w:rPr>
+        <w:t>m</w:t>
+      </w:r>
+      <w:r>
+        <w:rPr>
+          <w:b w:val="0"/>
+          <w:i w:val="0"/>
+        </w:rPr>
+        <w:t xml:space="preserve">) ≤ </w:t>
+      </w:r>
+      <w:r>
+        <w:rPr>
+          <w:b w:val="0"/>
+          <w:i/>
+        </w:rPr>
+        <w:t>cm</w:t>
+      </w:r>
+      <w:r>
+        <w:rPr>
+          <w:b w:val="0"/>
+          <w:i w:val="0"/>
+        </w:rPr>
+        <w:t xml:space="preserve"> lg </w:t>
+      </w:r>
+      <w:r>
+        <w:rPr>
+          <w:b w:val="0"/>
+          <w:i/>
+        </w:rPr>
+        <w:t>m</w:t>
+      </w:r>
+      <w:r>
+        <w:rPr>
+          <w:b w:val="0"/>
+          <w:i w:val="0"/>
+        </w:rPr>
+        <w:t xml:space="preserve"> for all </w:t>
+      </w:r>
+      <w:r>
+        <w:rPr>
+          <w:b w:val="0"/>
+          <w:i/>
+        </w:rPr>
+        <w:t>m</w:t>
+      </w:r>
+      <w:r>
+        <w:rPr>
+          <w:b w:val="0"/>
+          <w:i w:val="0"/>
+        </w:rPr>
+        <w:t xml:space="preserve"> &lt; </w:t>
+      </w:r>
+      <w:r>
+        <w:rPr>
+          <w:b w:val="0"/>
+          <w:i/>
+        </w:rPr>
+        <w:t>n</w:t>
+      </w:r>
+      <w:r>
+        <w:rPr>
+          <w:b w:val="0"/>
+          <w:i w:val="0"/>
+        </w:rPr>
+        <w:t>. Then T(</w:t>
+      </w:r>
+      <w:r>
+        <w:rPr>
+          <w:b w:val="0"/>
+          <w:i/>
+        </w:rPr>
+        <w:t>n</w:t>
+      </w:r>
+      <w:r>
+        <w:rPr>
+          <w:b w:val="0"/>
+          <w:i w:val="0"/>
+        </w:rPr>
+        <w:t>) ≤ 2</w:t>
+      </w:r>
+      <w:r>
+        <w:rPr>
+          <w:b w:val="0"/>
+          <w:i/>
+        </w:rPr>
+        <w:t>c</w:t>
+      </w:r>
+      <w:r>
+        <w:rPr>
+          <w:b w:val="0"/>
+          <w:i w:val="0"/>
+        </w:rPr>
+        <w:t>(</w:t>
+      </w:r>
+      <w:r>
+        <w:rPr>
+          <w:b w:val="0"/>
+          <w:i/>
+        </w:rPr>
+        <w:t>n</w:t>
+      </w:r>
+      <w:r>
+        <w:rPr>
+          <w:b w:val="0"/>
+          <w:i w:val="0"/>
+        </w:rPr>
+        <w:t>/2) lg(</w:t>
+      </w:r>
+      <w:r>
+        <w:rPr>
+          <w:b w:val="0"/>
+          <w:i/>
+        </w:rPr>
+        <w:t>n</w:t>
+      </w:r>
+      <w:r>
+        <w:rPr>
+          <w:b w:val="0"/>
+          <w:i w:val="0"/>
+        </w:rPr>
+        <w:t xml:space="preserve">/2) + </w:t>
+      </w:r>
+      <w:r>
+        <w:rPr>
+          <w:b w:val="0"/>
+          <w:i/>
+        </w:rPr>
+        <w:t>dn</w:t>
+      </w:r>
+      <w:r>
+        <w:rPr>
+          <w:b w:val="0"/>
+          <w:i w:val="0"/>
+        </w:rPr>
+        <w:t xml:space="preserve"> = </w:t>
       </w:r>
       <w:r>
         <w:rPr>
@@ -527,7 +723,7 @@
           <w:b w:val="0"/>
           <w:i w:val="0"/>
         </w:rPr>
-        <w:t xml:space="preserve"> = Θ(</w:t>
+        <w:t xml:space="preserve"> lg </w:t>
       </w:r>
       <w:r>
         <w:rPr>
@@ -541,7 +737,35 @@
           <w:b w:val="0"/>
           <w:i w:val="0"/>
         </w:rPr>
-        <w:t xml:space="preserve"> lg </w:t>
+        <w:t xml:space="preserve"> − (</w:t>
+      </w:r>
+      <w:r>
+        <w:rPr>
+          <w:b w:val="0"/>
+          <w:i/>
+        </w:rPr>
+        <w:t>c</w:t>
+      </w:r>
+      <w:r>
+        <w:rPr>
+          <w:b w:val="0"/>
+          <w:i w:val="0"/>
+        </w:rPr>
+        <w:t xml:space="preserve"> − </w:t>
+      </w:r>
+      <w:r>
+        <w:rPr>
+          <w:b w:val="0"/>
+          <w:i/>
+        </w:rPr>
+        <w:t>d</w:t>
+      </w:r>
+      <w:r>
+        <w:rPr>
+          <w:b w:val="0"/>
+          <w:i w:val="0"/>
+        </w:rPr>
+        <w:t>)</w:t>
       </w:r>
       <w:r>
         <w:rPr>
@@ -555,21 +779,21 @@
           <w:b w:val="0"/>
           <w:i w:val="0"/>
         </w:rPr>
-        <w:t xml:space="preserve">). </w:t>
+        <w:t xml:space="preserve">, which is at most </w:t>
       </w:r>
       <w:r>
         <w:rPr>
           <w:b w:val="0"/>
           <w:i/>
         </w:rPr>
-        <w:t>Substitution.</w:t>
+        <w:t>cn</w:t>
       </w:r>
       <w:r>
         <w:rPr>
           <w:b w:val="0"/>
           <w:i w:val="0"/>
         </w:rPr>
-        <w:t xml:space="preserve"> Guess T(</w:t>
+        <w:t xml:space="preserve"> lg </w:t>
       </w:r>
       <w:r>
         <w:rPr>
@@ -583,7 +807,198 @@
           <w:b w:val="0"/>
           <w:i w:val="0"/>
         </w:rPr>
-        <w:t xml:space="preserve">) ≤ </w:t>
+        <w:t xml:space="preserve"> once </w:t>
+      </w:r>
+      <w:r>
+        <w:rPr>
+          <w:b w:val="0"/>
+          <w:i/>
+        </w:rPr>
+        <w:t>c</w:t>
+      </w:r>
+      <w:r>
+        <w:rPr>
+          <w:b w:val="0"/>
+          <w:i w:val="0"/>
+        </w:rPr>
+        <w:t xml:space="preserve"> ≥ </w:t>
+      </w:r>
+      <w:r>
+        <w:rPr>
+          <w:b w:val="0"/>
+          <w:i/>
+        </w:rPr>
+        <w:t>d</w:t>
+      </w:r>
+      <w:r>
+        <w:rPr>
+          <w:b w:val="0"/>
+          <w:i w:val="0"/>
+        </w:rPr>
+        <w:t>; the lower bound is proved the same way. Merge Sort is therefore Θ(</w:t>
+      </w:r>
+      <w:r>
+        <w:rPr>
+          <w:b w:val="0"/>
+          <w:i/>
+        </w:rPr>
+        <w:t>n</w:t>
+      </w:r>
+      <w:r>
+        <w:rPr>
+          <w:b w:val="0"/>
+          <w:i w:val="0"/>
+        </w:rPr>
+        <w:t xml:space="preserve"> lg </w:t>
+      </w:r>
+      <w:r>
+        <w:rPr>
+          <w:b w:val="0"/>
+          <w:i/>
+        </w:rPr>
+        <w:t>n</w:t>
+      </w:r>
+      <w:r>
+        <w:rPr>
+          <w:b w:val="0"/>
+          <w:i w:val="0"/>
+        </w:rPr>
+        <w:t>), which means O(</w:t>
+      </w:r>
+      <w:r>
+        <w:rPr>
+          <w:b w:val="0"/>
+          <w:i/>
+        </w:rPr>
+        <w:t>n</w:t>
+      </w:r>
+      <w:r>
+        <w:rPr>
+          <w:b w:val="0"/>
+          <w:i w:val="0"/>
+        </w:rPr>
+        <w:t xml:space="preserve"> lg </w:t>
+      </w:r>
+      <w:r>
+        <w:rPr>
+          <w:b w:val="0"/>
+          <w:i/>
+        </w:rPr>
+        <w:t>n</w:t>
+      </w:r>
+      <w:r>
+        <w:rPr>
+          <w:b w:val="0"/>
+          <w:i w:val="0"/>
+        </w:rPr>
+        <w:t>) and Ω(</w:t>
+      </w:r>
+      <w:r>
+        <w:rPr>
+          <w:b w:val="0"/>
+          <w:i/>
+        </w:rPr>
+        <w:t>n</w:t>
+      </w:r>
+      <w:r>
+        <w:rPr>
+          <w:b w:val="0"/>
+          <w:i w:val="0"/>
+        </w:rPr>
+        <w:t xml:space="preserve"> lg </w:t>
+      </w:r>
+      <w:r>
+        <w:rPr>
+          <w:b w:val="0"/>
+          <w:i/>
+        </w:rPr>
+        <w:t>n</w:t>
+      </w:r>
+      <w:r>
+        <w:rPr>
+          <w:b w:val="0"/>
+          <w:i w:val="0"/>
+        </w:rPr>
+        <w:t>), regardless of whether the input is best, average, or worst case. Its costs are Θ(</w:t>
+      </w:r>
+      <w:r>
+        <w:rPr>
+          <w:b w:val="0"/>
+          <w:i/>
+        </w:rPr>
+        <w:t>n</w:t>
+      </w:r>
+      <w:r>
+        <w:rPr>
+          <w:b w:val="0"/>
+          <w:i w:val="0"/>
+        </w:rPr>
+        <w:t>) extra memory for the merge buffers; in exchange it is stable.</w:t>
+      </w:r>
+    </w:p>
+    <w:p>
+      <w:pPr>
+        <w:pStyle w:val="Heading2"/>
+      </w:pPr>
+      <w:r>
+        <w:t>Quick Sort</w:t>
+      </w:r>
+    </w:p>
+    <w:p>
+      <w:pPr>
+        <w:ind w:firstLine="720"/>
+      </w:pPr>
+      <w:r>
+        <w:rPr>
+          <w:b w:val="0"/>
+          <w:i w:val="0"/>
+        </w:rPr>
+        <w:t>Quick Sort flips this arrangement: dividing is the expensive step and combining costs nothing (Sedgewick, 1978). It picks a pivot (the last item here, following the Lomuto scheme presented by Bentley, 2000), rearranges the list so that keys no larger than the pivot sit to its left and larger keys to its right, and then sorts those two parts recursively. Partitioning is Θ(</w:t>
+      </w:r>
+      <w:r>
+        <w:rPr>
+          <w:b w:val="0"/>
+          <w:i/>
+        </w:rPr>
+        <w:t>n</w:t>
+      </w:r>
+      <w:r>
+        <w:rPr>
+          <w:b w:val="0"/>
+          <w:i w:val="0"/>
+        </w:rPr>
+        <w:t>), but the sizes of the two parts depend on the pivot, so the recurrence depends on the data:</w:t>
+      </w:r>
+    </w:p>
+    <w:p>
+      <w:pPr>
+        <w:jc w:val="center"/>
+      </w:pPr>
+      <w:r>
+        <w:rPr>
+          <w:b w:val="0"/>
+          <w:i w:val="0"/>
+        </w:rPr>
+        <w:t>Worst: T(n) = T(n − 1) + T(0) + Θ(n)        Best: T(n) = 2T(n/2) + Θ(n)</w:t>
+      </w:r>
+    </w:p>
+    <w:p>
+      <w:pPr>
+        <w:ind w:firstLine="720"/>
+      </w:pPr>
+      <w:r>
+        <w:rPr>
+          <w:b w:val="0"/>
+          <w:i/>
+        </w:rPr>
+        <w:t>Worst case.</w:t>
+      </w:r>
+      <w:r>
+        <w:rPr>
+          <w:b w:val="0"/>
+          <w:i w:val="0"/>
+        </w:rPr>
+        <w:t xml:space="preserve"> If every pivot is the smallest or largest key, which is exactly what a last-item pivot meets on ascending or descending input, the recursion tree degenerates into a chain with level costs </w:t>
       </w:r>
       <w:r>
         <w:rPr>
@@ -597,7 +1012,21 @@
           <w:b w:val="0"/>
           <w:i w:val="0"/>
         </w:rPr>
-        <w:t xml:space="preserve"> lg </w:t>
+        <w:t xml:space="preserve">, </w:t>
+      </w:r>
+      <w:r>
+        <w:rPr>
+          <w:b w:val="0"/>
+          <w:i/>
+        </w:rPr>
+        <w:t>c</w:t>
+      </w:r>
+      <w:r>
+        <w:rPr>
+          <w:b w:val="0"/>
+          <w:i w:val="0"/>
+        </w:rPr>
+        <w:t>(</w:t>
       </w:r>
       <w:r>
         <w:rPr>
@@ -611,7 +1040,21 @@
           <w:b w:val="0"/>
           <w:i w:val="0"/>
         </w:rPr>
-        <w:t xml:space="preserve">. Assuming it holds for </w:t>
+        <w:t xml:space="preserve"> − 1), …, </w:t>
+      </w:r>
+      <w:r>
+        <w:rPr>
+          <w:b w:val="0"/>
+          <w:i/>
+        </w:rPr>
+        <w:t>c</w:t>
+      </w:r>
+      <w:r>
+        <w:rPr>
+          <w:b w:val="0"/>
+          <w:i w:val="0"/>
+        </w:rPr>
+        <w:t>, totaling Θ(</w:t>
       </w:r>
       <w:r>
         <w:rPr>
@@ -625,7 +1068,49 @@
           <w:b w:val="0"/>
           <w:i w:val="0"/>
         </w:rPr>
-        <w:t>/2, T(</w:t>
+        <w:t>²). By substitution, assuming T(</w:t>
+      </w:r>
+      <w:r>
+        <w:rPr>
+          <w:b w:val="0"/>
+          <w:i/>
+        </w:rPr>
+        <w:t>m</w:t>
+      </w:r>
+      <w:r>
+        <w:rPr>
+          <w:b w:val="0"/>
+          <w:i w:val="0"/>
+        </w:rPr>
+        <w:t xml:space="preserve">) ≤ </w:t>
+      </w:r>
+      <w:r>
+        <w:rPr>
+          <w:b w:val="0"/>
+          <w:i/>
+        </w:rPr>
+        <w:t>cm</w:t>
+      </w:r>
+      <w:r>
+        <w:rPr>
+          <w:b w:val="0"/>
+          <w:i w:val="0"/>
+        </w:rPr>
+        <w:t xml:space="preserve">² for </w:t>
+      </w:r>
+      <w:r>
+        <w:rPr>
+          <w:b w:val="0"/>
+          <w:i/>
+        </w:rPr>
+        <w:t>m</w:t>
+      </w:r>
+      <w:r>
+        <w:rPr>
+          <w:b w:val="0"/>
+          <w:i w:val="0"/>
+        </w:rPr>
+        <w:t xml:space="preserve"> &lt; </w:t>
       </w:r>
       <w:r>
         <w:rPr>
@@ -639,7 +1124,21 @@
           <w:b w:val="0"/>
           <w:i w:val="0"/>
         </w:rPr>
-        <w:t>) ≤ 2</w:t>
+        <w:t xml:space="preserve"> gives T(</w:t>
+      </w:r>
+      <w:r>
+        <w:rPr>
+          <w:b w:val="0"/>
+          <w:i/>
+        </w:rPr>
+        <w:t>n</w:t>
+      </w:r>
+      <w:r>
+        <w:rPr>
+          <w:b w:val="0"/>
+          <w:i w:val="0"/>
+        </w:rPr>
+        <w:t xml:space="preserve">) ≤ </w:t>
       </w:r>
       <w:r>
         <w:rPr>
@@ -667,7 +1166,49 @@
           <w:b w:val="0"/>
           <w:i w:val="0"/>
         </w:rPr>
-        <w:t>/2) lg(</w:t>
+        <w:t xml:space="preserve"> − 1)² + </w:t>
+      </w:r>
+      <w:r>
+        <w:rPr>
+          <w:b w:val="0"/>
+          <w:i/>
+        </w:rPr>
+        <w:t>dn</w:t>
+      </w:r>
+      <w:r>
+        <w:rPr>
+          <w:b w:val="0"/>
+          <w:i w:val="0"/>
+        </w:rPr>
+        <w:t xml:space="preserve"> = </w:t>
+      </w:r>
+      <w:r>
+        <w:rPr>
+          <w:b w:val="0"/>
+          <w:i/>
+        </w:rPr>
+        <w:t>cn</w:t>
+      </w:r>
+      <w:r>
+        <w:rPr>
+          <w:b w:val="0"/>
+          <w:i w:val="0"/>
+        </w:rPr>
+        <w:t xml:space="preserve">² − </w:t>
+      </w:r>
+      <w:r>
+        <w:rPr>
+          <w:b w:val="0"/>
+          <w:i/>
+        </w:rPr>
+        <w:t>c</w:t>
+      </w:r>
+      <w:r>
+        <w:rPr>
+          <w:b w:val="0"/>
+          <w:i w:val="0"/>
+        </w:rPr>
+        <w:t>(2</w:t>
       </w:r>
       <w:r>
         <w:rPr>
@@ -681,7 +1222,7 @@
           <w:b w:val="0"/>
           <w:i w:val="0"/>
         </w:rPr>
-        <w:t xml:space="preserve">/2) + </w:t>
+        <w:t xml:space="preserve"> − 1) + </w:t>
       </w:r>
       <w:r>
         <w:rPr>
@@ -695,7 +1236,7 @@
           <w:b w:val="0"/>
           <w:i w:val="0"/>
         </w:rPr>
-        <w:t xml:space="preserve"> = </w:t>
+        <w:t xml:space="preserve">, which stays below </w:t>
       </w:r>
       <w:r>
         <w:rPr>
@@ -709,7 +1250,35 @@
           <w:b w:val="0"/>
           <w:i w:val="0"/>
         </w:rPr>
-        <w:t xml:space="preserve"> lg </w:t>
+        <w:t xml:space="preserve">² for </w:t>
+      </w:r>
+      <w:r>
+        <w:rPr>
+          <w:b w:val="0"/>
+          <w:i/>
+        </w:rPr>
+        <w:t>c</w:t>
+      </w:r>
+      <w:r>
+        <w:rPr>
+          <w:b w:val="0"/>
+          <w:i w:val="0"/>
+        </w:rPr>
+        <w:t xml:space="preserve"> ≥ </w:t>
+      </w:r>
+      <w:r>
+        <w:rPr>
+          <w:b w:val="0"/>
+          <w:i/>
+        </w:rPr>
+        <w:t>d</w:t>
+      </w:r>
+      <w:r>
+        <w:rPr>
+          <w:b w:val="0"/>
+          <w:i w:val="0"/>
+        </w:rPr>
+        <w:t xml:space="preserve">. The master method cannot be used here, since the subproblem has size </w:t>
       </w:r>
       <w:r>
         <w:rPr>
@@ -723,42 +1292,56 @@
           <w:b w:val="0"/>
           <w:i w:val="0"/>
         </w:rPr>
-        <w:t xml:space="preserve"> − </w:t>
+        <w:t xml:space="preserve"> − 1 rather than </w:t>
       </w:r>
       <w:r>
         <w:rPr>
           <w:b w:val="0"/>
           <w:i/>
         </w:rPr>
-        <w:t>cn</w:t>
+        <w:t>n</w:t>
       </w:r>
       <w:r>
         <w:rPr>
           <w:b w:val="0"/>
           <w:i w:val="0"/>
         </w:rPr>
-        <w:t xml:space="preserve"> + </w:t>
+        <w:t>/</w:t>
       </w:r>
       <w:r>
         <w:rPr>
           <w:b w:val="0"/>
           <w:i/>
         </w:rPr>
-        <w:t>dn</w:t>
+        <w:t>b</w:t>
       </w:r>
       <w:r>
         <w:rPr>
           <w:b w:val="0"/>
           <w:i w:val="0"/>
         </w:rPr>
-        <w:t xml:space="preserve"> ≤ </w:t>
+        <w:t xml:space="preserve">. </w:t>
       </w:r>
       <w:r>
         <w:rPr>
           <w:b w:val="0"/>
           <w:i/>
         </w:rPr>
-        <w:t>cn</w:t>
+        <w:t>Best and average case.</w:t>
+      </w:r>
+      <w:r>
+        <w:rPr>
+          <w:b w:val="0"/>
+          <w:i w:val="0"/>
+        </w:rPr>
+        <w:t xml:space="preserve"> Balanced splits reproduce the Merge Sort recurrence and give Θ(</w:t>
+      </w:r>
+      <w:r>
+        <w:rPr>
+          <w:b w:val="0"/>
+          <w:i/>
+        </w:rPr>
+        <w:t>n</w:t>
       </w:r>
       <w:r>
         <w:rPr>
@@ -779,35 +1362,7 @@
           <w:b w:val="0"/>
           <w:i w:val="0"/>
         </w:rPr>
-        <w:t xml:space="preserve"> whenever </w:t>
-      </w:r>
-      <w:r>
-        <w:rPr>
-          <w:b w:val="0"/>
-          <w:i/>
-        </w:rPr>
-        <w:t>c</w:t>
-      </w:r>
-      <w:r>
-        <w:rPr>
-          <w:b w:val="0"/>
-          <w:i w:val="0"/>
-        </w:rPr>
-        <w:t xml:space="preserve"> ≥ </w:t>
-      </w:r>
-      <w:r>
-        <w:rPr>
-          <w:b w:val="0"/>
-          <w:i/>
-        </w:rPr>
-        <w:t>d</w:t>
-      </w:r>
-      <w:r>
-        <w:rPr>
-          <w:b w:val="0"/>
-          <w:i w:val="0"/>
-        </w:rPr>
-        <w:t>. A matching lower bound follows the same way, so Merge Sort is Θ(</w:t>
+        <w:t xml:space="preserve">) by master-method case 2. Any fixed proportion, even 9 to 1, still keeps the tree O(log </w:t>
       </w:r>
       <w:r>
         <w:rPr>
@@ -821,7 +1376,7 @@
           <w:b w:val="0"/>
           <w:i w:val="0"/>
         </w:rPr>
-        <w:t xml:space="preserve"> lg </w:t>
+        <w:t xml:space="preserve">) deep, and a random pivot needs about 1.39 </w:t>
       </w:r>
       <w:r>
         <w:rPr>
@@ -835,7 +1390,7 @@
           <w:b w:val="0"/>
           <w:i w:val="0"/>
         </w:rPr>
-        <w:t>) and hence both O(</w:t>
+        <w:t xml:space="preserve"> lg </w:t>
       </w:r>
       <w:r>
         <w:rPr>
@@ -849,7 +1404,7 @@
           <w:b w:val="0"/>
           <w:i w:val="0"/>
         </w:rPr>
-        <w:t xml:space="preserve"> lg </w:t>
+        <w:t xml:space="preserve"> comparisons on average (Sedgewick, 1978). In short, Quick Sort is O(</w:t>
       </w:r>
       <w:r>
         <w:rPr>
@@ -863,7 +1418,7 @@
           <w:b w:val="0"/>
           <w:i w:val="0"/>
         </w:rPr>
-        <w:t>) and Ω(</w:t>
+        <w:t>²) and Ω(</w:t>
       </w:r>
       <w:r>
         <w:rPr>
@@ -891,7 +1446,7 @@
           <w:b w:val="0"/>
           <w:i w:val="0"/>
         </w:rPr>
-        <w:t>) in the best, average, and worst cases. The cost is Θ(</w:t>
+        <w:t>), with Θ(</w:t>
       </w:r>
       <w:r>
         <w:rPr>
@@ -905,7 +1460,49 @@
           <w:b w:val="0"/>
           <w:i w:val="0"/>
         </w:rPr>
-        <w:t>) auxiliary memory for the merge buffers. Merge Sort is also stable.</w:t>
+        <w:t>²) worst-case and Θ(</w:t>
+      </w:r>
+      <w:r>
+        <w:rPr>
+          <w:b w:val="0"/>
+          <w:i/>
+        </w:rPr>
+        <w:t>n</w:t>
+      </w:r>
+      <w:r>
+        <w:rPr>
+          <w:b w:val="0"/>
+          <w:i w:val="0"/>
+        </w:rPr>
+        <w:t xml:space="preserve"> lg </w:t>
+      </w:r>
+      <w:r>
+        <w:rPr>
+          <w:b w:val="0"/>
+          <w:i/>
+        </w:rPr>
+        <w:t>n</w:t>
+      </w:r>
+      <w:r>
+        <w:rPr>
+          <w:b w:val="0"/>
+          <w:i w:val="0"/>
+        </w:rPr>
+        <w:t xml:space="preserve">) best- and expected-case time. It works in place, needs only an O(lg </w:t>
+      </w:r>
+      <w:r>
+        <w:rPr>
+          <w:b w:val="0"/>
+          <w:i/>
+        </w:rPr>
+        <w:t>n</w:t>
+      </w:r>
+      <w:r>
+        <w:rPr>
+          <w:b w:val="0"/>
+          <w:i w:val="0"/>
+        </w:rPr>
+        <w:t>) stack when the smaller part is handled first, and is not stable.</w:t>
       </w:r>
     </w:p>
     <w:p>
@@ -913,7 +1510,7 @@
         <w:pStyle w:val="Heading2"/>
       </w:pPr>
       <w:r>
-        <w:t>Quick Sort</w:t>
+        <w:t>Practical Implications</w:t>
       </w:r>
     </w:p>
     <w:p>
@@ -925,7 +1522,7 @@
           <w:b w:val="0"/>
           <w:i w:val="0"/>
         </w:rPr>
-        <w:t>Quick Sort reverses the balance: it does its real work while dividing and needs no combine step (Sedgewick, 1978). It (1) chooses a pivot (here the last element, as in the Lomuto partition scheme described by Bentley, 2000), (2) partitions the array so that smaller keys precede the pivot and larger keys follow it, and (3) recursively sorts the two sides. Partitioning costs Θ(</w:t>
+        <w:t>Because Merge Sort never exceeds Θ(</w:t>
       </w:r>
       <w:r>
         <w:rPr>
@@ -939,19 +1536,29 @@
           <w:b w:val="0"/>
           <w:i w:val="0"/>
         </w:rPr>
-        <w:t>), but the split depends on the pivot, so the recurrence depends on the input:</w:t>
-      </w:r>
-    </w:p>
-    <w:p>
-      <w:pPr>
-        <w:jc w:val="center"/>
-      </w:pPr>
+        <w:t xml:space="preserve"> lg </w:t>
+      </w:r>
+      <w:r>
+        <w:rPr>
+          <w:b w:val="0"/>
+          <w:i/>
+        </w:rPr>
+        <w:t>n</w:t>
+      </w:r>
       <w:r>
         <w:rPr>
           <w:b w:val="0"/>
           <w:i w:val="0"/>
         </w:rPr>
-        <w:t>Worst: T(n) = T(n − 1) + T(0) + Θ(n)        Best: T(n) = 2T(n/2) + Θ(n)</w:t>
+        <w:t>) and preserves the order of equal keys, it fits applications that need guaranteed response times or multi-key sorting of records. It reads data sequentially, which also makes it the standard approach for external sorting of files larger than memory, and Python’s built-in Timsort is a merge-based hybrid (Auger et al., 2018). Quick Sort’s in-place partitioning and short inner loop usually make it the fastest in-memory comparison sort, which is why C’s qsort (Bentley &amp; McIlroy, 1993) and C++’s introsort rely on it; library versions sample the pivot and switch to heapsort when recursion gets too deep, so the quadratic case never occurs (Musser, 1997).</w:t>
+      </w:r>
+    </w:p>
+    <w:p>
+      <w:pPr>
+        <w:pStyle w:val="Heading2"/>
+      </w:pPr>
+      <w:r>
+        <w:t>Implementation</w:t>
       </w:r>
     </w:p>
     <w:p>
@@ -961,588 +1568,9 @@
       <w:r>
         <w:rPr>
           <w:b w:val="0"/>
-          <w:i/>
-        </w:rPr>
-        <w:t>Worst case.</w:t>
-      </w:r>
-      <w:r>
-        <w:rPr>
-          <w:b w:val="0"/>
           <w:i w:val="0"/>
         </w:rPr>
-        <w:t xml:space="preserve"> When the pivot is always the minimum or maximum, as happens with a last-element pivot on sorted or reverse-sorted input, the recursion tree is a path whose levels cost </w:t>
-      </w:r>
-      <w:r>
-        <w:rPr>
-          <w:b w:val="0"/>
-          <w:i/>
-        </w:rPr>
-        <w:t>cn</w:t>
-      </w:r>
-      <w:r>
-        <w:rPr>
-          <w:b w:val="0"/>
-          <w:i w:val="0"/>
-        </w:rPr>
-        <w:t xml:space="preserve">, </w:t>
-      </w:r>
-      <w:r>
-        <w:rPr>
-          <w:b w:val="0"/>
-          <w:i/>
-        </w:rPr>
-        <w:t>c</w:t>
-      </w:r>
-      <w:r>
-        <w:rPr>
-          <w:b w:val="0"/>
-          <w:i w:val="0"/>
-        </w:rPr>
-        <w:t>(</w:t>
-      </w:r>
-      <w:r>
-        <w:rPr>
-          <w:b w:val="0"/>
-          <w:i/>
-        </w:rPr>
-        <w:t>n</w:t>
-      </w:r>
-      <w:r>
-        <w:rPr>
-          <w:b w:val="0"/>
-          <w:i w:val="0"/>
-        </w:rPr>
-        <w:t xml:space="preserve"> − 1), …, </w:t>
-      </w:r>
-      <w:r>
-        <w:rPr>
-          <w:b w:val="0"/>
-          <w:i/>
-        </w:rPr>
-        <w:t>c</w:t>
-      </w:r>
-      <w:r>
-        <w:rPr>
-          <w:b w:val="0"/>
-          <w:i w:val="0"/>
-        </w:rPr>
-        <w:t>, summing to Θ(</w:t>
-      </w:r>
-      <w:r>
-        <w:rPr>
-          <w:b w:val="0"/>
-          <w:i/>
-        </w:rPr>
-        <w:t>n</w:t>
-      </w:r>
-      <w:r>
-        <w:rPr>
-          <w:b w:val="0"/>
-          <w:i w:val="0"/>
-        </w:rPr>
-        <w:t>²). Substitution confirms it: guessing T(</w:t>
-      </w:r>
-      <w:r>
-        <w:rPr>
-          <w:b w:val="0"/>
-          <w:i/>
-        </w:rPr>
-        <w:t>n</w:t>
-      </w:r>
-      <w:r>
-        <w:rPr>
-          <w:b w:val="0"/>
-          <w:i w:val="0"/>
-        </w:rPr>
-        <w:t xml:space="preserve">) ≤ </w:t>
-      </w:r>
-      <w:r>
-        <w:rPr>
-          <w:b w:val="0"/>
-          <w:i/>
-        </w:rPr>
-        <w:t>cn</w:t>
-      </w:r>
-      <w:r>
-        <w:rPr>
-          <w:b w:val="0"/>
-          <w:i w:val="0"/>
-        </w:rPr>
-        <w:t>² gives T(</w:t>
-      </w:r>
-      <w:r>
-        <w:rPr>
-          <w:b w:val="0"/>
-          <w:i/>
-        </w:rPr>
-        <w:t>n</w:t>
-      </w:r>
-      <w:r>
-        <w:rPr>
-          <w:b w:val="0"/>
-          <w:i w:val="0"/>
-        </w:rPr>
-        <w:t xml:space="preserve">) ≤ </w:t>
-      </w:r>
-      <w:r>
-        <w:rPr>
-          <w:b w:val="0"/>
-          <w:i/>
-        </w:rPr>
-        <w:t>c</w:t>
-      </w:r>
-      <w:r>
-        <w:rPr>
-          <w:b w:val="0"/>
-          <w:i w:val="0"/>
-        </w:rPr>
-        <w:t>(</w:t>
-      </w:r>
-      <w:r>
-        <w:rPr>
-          <w:b w:val="0"/>
-          <w:i/>
-        </w:rPr>
-        <w:t>n</w:t>
-      </w:r>
-      <w:r>
-        <w:rPr>
-          <w:b w:val="0"/>
-          <w:i w:val="0"/>
-        </w:rPr>
-        <w:t xml:space="preserve"> − 1)² + </w:t>
-      </w:r>
-      <w:r>
-        <w:rPr>
-          <w:b w:val="0"/>
-          <w:i/>
-        </w:rPr>
-        <w:t>dn</w:t>
-      </w:r>
-      <w:r>
-        <w:rPr>
-          <w:b w:val="0"/>
-          <w:i w:val="0"/>
-        </w:rPr>
-        <w:t xml:space="preserve"> = </w:t>
-      </w:r>
-      <w:r>
-        <w:rPr>
-          <w:b w:val="0"/>
-          <w:i/>
-        </w:rPr>
-        <w:t>cn</w:t>
-      </w:r>
-      <w:r>
-        <w:rPr>
-          <w:b w:val="0"/>
-          <w:i w:val="0"/>
-        </w:rPr>
-        <w:t xml:space="preserve">² − </w:t>
-      </w:r>
-      <w:r>
-        <w:rPr>
-          <w:b w:val="0"/>
-          <w:i/>
-        </w:rPr>
-        <w:t>c</w:t>
-      </w:r>
-      <w:r>
-        <w:rPr>
-          <w:b w:val="0"/>
-          <w:i w:val="0"/>
-        </w:rPr>
-        <w:t>(2</w:t>
-      </w:r>
-      <w:r>
-        <w:rPr>
-          <w:b w:val="0"/>
-          <w:i/>
-        </w:rPr>
-        <w:t>n</w:t>
-      </w:r>
-      <w:r>
-        <w:rPr>
-          <w:b w:val="0"/>
-          <w:i w:val="0"/>
-        </w:rPr>
-        <w:t xml:space="preserve"> − 1) + </w:t>
-      </w:r>
-      <w:r>
-        <w:rPr>
-          <w:b w:val="0"/>
-          <w:i/>
-        </w:rPr>
-        <w:t>dn</w:t>
-      </w:r>
-      <w:r>
-        <w:rPr>
-          <w:b w:val="0"/>
-          <w:i w:val="0"/>
-        </w:rPr>
-        <w:t xml:space="preserve"> ≤ </w:t>
-      </w:r>
-      <w:r>
-        <w:rPr>
-          <w:b w:val="0"/>
-          <w:i/>
-        </w:rPr>
-        <w:t>cn</w:t>
-      </w:r>
-      <w:r>
-        <w:rPr>
-          <w:b w:val="0"/>
-          <w:i w:val="0"/>
-        </w:rPr>
-        <w:t xml:space="preserve">² for </w:t>
-      </w:r>
-      <w:r>
-        <w:rPr>
-          <w:b w:val="0"/>
-          <w:i/>
-        </w:rPr>
-        <w:t>c</w:t>
-      </w:r>
-      <w:r>
-        <w:rPr>
-          <w:b w:val="0"/>
-          <w:i w:val="0"/>
-        </w:rPr>
-        <w:t xml:space="preserve"> ≥ </w:t>
-      </w:r>
-      <w:r>
-        <w:rPr>
-          <w:b w:val="0"/>
-          <w:i/>
-        </w:rPr>
-        <w:t>d</w:t>
-      </w:r>
-      <w:r>
-        <w:rPr>
-          <w:b w:val="0"/>
-          <w:i w:val="0"/>
-        </w:rPr>
-        <w:t xml:space="preserve">. The master method does not apply because the subproblem is </w:t>
-      </w:r>
-      <w:r>
-        <w:rPr>
-          <w:b w:val="0"/>
-          <w:i/>
-        </w:rPr>
-        <w:t>n</w:t>
-      </w:r>
-      <w:r>
-        <w:rPr>
-          <w:b w:val="0"/>
-          <w:i w:val="0"/>
-        </w:rPr>
-        <w:t xml:space="preserve"> − 1, not </w:t>
-      </w:r>
-      <w:r>
-        <w:rPr>
-          <w:b w:val="0"/>
-          <w:i/>
-        </w:rPr>
-        <w:t>n</w:t>
-      </w:r>
-      <w:r>
-        <w:rPr>
-          <w:b w:val="0"/>
-          <w:i w:val="0"/>
-        </w:rPr>
-        <w:t>/</w:t>
-      </w:r>
-      <w:r>
-        <w:rPr>
-          <w:b w:val="0"/>
-          <w:i/>
-        </w:rPr>
-        <w:t>b</w:t>
-      </w:r>
-      <w:r>
-        <w:rPr>
-          <w:b w:val="0"/>
-          <w:i w:val="0"/>
-        </w:rPr>
-        <w:t xml:space="preserve">. </w:t>
-      </w:r>
-      <w:r>
-        <w:rPr>
-          <w:b w:val="0"/>
-          <w:i/>
-        </w:rPr>
-        <w:t>Best and average case.</w:t>
-      </w:r>
-      <w:r>
-        <w:rPr>
-          <w:b w:val="0"/>
-          <w:i w:val="0"/>
-        </w:rPr>
-        <w:t xml:space="preserve"> An even split gives the Merge Sort recurrence and Θ(</w:t>
-      </w:r>
-      <w:r>
-        <w:rPr>
-          <w:b w:val="0"/>
-          <w:i/>
-        </w:rPr>
-        <w:t>n</w:t>
-      </w:r>
-      <w:r>
-        <w:rPr>
-          <w:b w:val="0"/>
-          <w:i w:val="0"/>
-        </w:rPr>
-        <w:t xml:space="preserve"> lg </w:t>
-      </w:r>
-      <w:r>
-        <w:rPr>
-          <w:b w:val="0"/>
-          <w:i/>
-        </w:rPr>
-        <w:t>n</w:t>
-      </w:r>
-      <w:r>
-        <w:rPr>
-          <w:b w:val="0"/>
-          <w:i w:val="0"/>
-        </w:rPr>
-        <w:t xml:space="preserve">) by case 2 of the master method. Even a constant-ratio split such as 9-to-1 yields a recursion tree of depth O(log </w:t>
-      </w:r>
-      <w:r>
-        <w:rPr>
-          <w:b w:val="0"/>
-          <w:i/>
-        </w:rPr>
-        <w:t>n</w:t>
-      </w:r>
-      <w:r>
-        <w:rPr>
-          <w:b w:val="0"/>
-          <w:i w:val="0"/>
-        </w:rPr>
-        <w:t>), so it is still O(</w:t>
-      </w:r>
-      <w:r>
-        <w:rPr>
-          <w:b w:val="0"/>
-          <w:i/>
-        </w:rPr>
-        <w:t>n</w:t>
-      </w:r>
-      <w:r>
-        <w:rPr>
-          <w:b w:val="0"/>
-          <w:i w:val="0"/>
-        </w:rPr>
-        <w:t xml:space="preserve"> lg </w:t>
-      </w:r>
-      <w:r>
-        <w:rPr>
-          <w:b w:val="0"/>
-          <w:i/>
-        </w:rPr>
-        <w:t>n</w:t>
-      </w:r>
-      <w:r>
-        <w:rPr>
-          <w:b w:val="0"/>
-          <w:i w:val="0"/>
-        </w:rPr>
-        <w:t xml:space="preserve">), and with a random pivot the expected number of comparisons is about 1.39 </w:t>
-      </w:r>
-      <w:r>
-        <w:rPr>
-          <w:b w:val="0"/>
-          <w:i/>
-        </w:rPr>
-        <w:t>n</w:t>
-      </w:r>
-      <w:r>
-        <w:rPr>
-          <w:b w:val="0"/>
-          <w:i w:val="0"/>
-        </w:rPr>
-        <w:t xml:space="preserve"> lg </w:t>
-      </w:r>
-      <w:r>
-        <w:rPr>
-          <w:b w:val="0"/>
-          <w:i/>
-        </w:rPr>
-        <w:t>n</w:t>
-      </w:r>
-      <w:r>
-        <w:rPr>
-          <w:b w:val="0"/>
-          <w:i w:val="0"/>
-        </w:rPr>
-        <w:t xml:space="preserve"> (Sedgewick, 1978). Overall, Quick Sort is O(</w:t>
-      </w:r>
-      <w:r>
-        <w:rPr>
-          <w:b w:val="0"/>
-          <w:i/>
-        </w:rPr>
-        <w:t>n</w:t>
-      </w:r>
-      <w:r>
-        <w:rPr>
-          <w:b w:val="0"/>
-          <w:i w:val="0"/>
-        </w:rPr>
-        <w:t>²) and Ω(</w:t>
-      </w:r>
-      <w:r>
-        <w:rPr>
-          <w:b w:val="0"/>
-          <w:i/>
-        </w:rPr>
-        <w:t>n</w:t>
-      </w:r>
-      <w:r>
-        <w:rPr>
-          <w:b w:val="0"/>
-          <w:i w:val="0"/>
-        </w:rPr>
-        <w:t xml:space="preserve"> lg </w:t>
-      </w:r>
-      <w:r>
-        <w:rPr>
-          <w:b w:val="0"/>
-          <w:i/>
-        </w:rPr>
-        <w:t>n</w:t>
-      </w:r>
-      <w:r>
-        <w:rPr>
-          <w:b w:val="0"/>
-          <w:i w:val="0"/>
-        </w:rPr>
-        <w:t>): Θ(</w:t>
-      </w:r>
-      <w:r>
-        <w:rPr>
-          <w:b w:val="0"/>
-          <w:i/>
-        </w:rPr>
-        <w:t>n</w:t>
-      </w:r>
-      <w:r>
-        <w:rPr>
-          <w:b w:val="0"/>
-          <w:i w:val="0"/>
-        </w:rPr>
-        <w:t>²) in the worst case and Θ(</w:t>
-      </w:r>
-      <w:r>
-        <w:rPr>
-          <w:b w:val="0"/>
-          <w:i/>
-        </w:rPr>
-        <w:t>n</w:t>
-      </w:r>
-      <w:r>
-        <w:rPr>
-          <w:b w:val="0"/>
-          <w:i w:val="0"/>
-        </w:rPr>
-        <w:t xml:space="preserve"> lg </w:t>
-      </w:r>
-      <w:r>
-        <w:rPr>
-          <w:b w:val="0"/>
-          <w:i/>
-        </w:rPr>
-        <w:t>n</w:t>
-      </w:r>
-      <w:r>
-        <w:rPr>
-          <w:b w:val="0"/>
-          <w:i w:val="0"/>
-        </w:rPr>
-        <w:t xml:space="preserve">) in the best and expected cases. It sorts in place with an O(lg </w:t>
-      </w:r>
-      <w:r>
-        <w:rPr>
-          <w:b w:val="0"/>
-          <w:i/>
-        </w:rPr>
-        <w:t>n</w:t>
-      </w:r>
-      <w:r>
-        <w:rPr>
-          <w:b w:val="0"/>
-          <w:i w:val="0"/>
-        </w:rPr>
-        <w:t>) stack (recursing on the smaller side first) and is not stable.</w:t>
-      </w:r>
-    </w:p>
-    <w:p>
-      <w:pPr>
-        <w:pStyle w:val="Heading2"/>
-      </w:pPr>
-      <w:r>
-        <w:t>Practical Implications</w:t>
-      </w:r>
-    </w:p>
-    <w:p>
-      <w:pPr>
-        <w:ind w:firstLine="720"/>
-      </w:pPr>
-      <w:r>
-        <w:rPr>
-          <w:b w:val="0"/>
-          <w:i w:val="0"/>
-        </w:rPr>
-        <w:t>Merge Sort’s fixed Θ(</w:t>
-      </w:r>
-      <w:r>
-        <w:rPr>
-          <w:b w:val="0"/>
-          <w:i/>
-        </w:rPr>
-        <w:t>n</w:t>
-      </w:r>
-      <w:r>
-        <w:rPr>
-          <w:b w:val="0"/>
-          <w:i w:val="0"/>
-        </w:rPr>
-        <w:t xml:space="preserve"> lg </w:t>
-      </w:r>
-      <w:r>
-        <w:rPr>
-          <w:b w:val="0"/>
-          <w:i/>
-        </w:rPr>
-        <w:t>n</w:t>
-      </w:r>
-      <w:r>
-        <w:rPr>
-          <w:b w:val="0"/>
-          <w:i w:val="0"/>
-        </w:rPr>
-        <w:t>) bound and stability make it the choice when worst-case time matters or when records must keep their order on equal keys; its sequential access pattern also makes it the basis of external sorting of files that do not fit in memory. Python’s own Timsort is a merge-based hybrid (Auger et al., 2018). Quick Sort’s in-place partitioning and tight inner loop usually make it the fastest comparison sort in memory, which is why C’s qsort (Bentley &amp; McIlroy, 1993) and C++’s introsort build on it, but production versions sample the pivot and fall back to heapsort to avoid the quadratic case (Musser, 1997).</w:t>
-      </w:r>
-    </w:p>
-    <w:p>
-      <w:pPr>
-        <w:pStyle w:val="Heading2"/>
-      </w:pPr>
-      <w:r>
-        <w:t>Implementation</w:t>
-      </w:r>
-    </w:p>
-    <w:p>
-      <w:pPr>
-        <w:ind w:firstLine="720"/>
-      </w:pPr>
-      <w:r>
-        <w:rPr>
-          <w:b w:val="0"/>
-          <w:i w:val="0"/>
-        </w:rPr>
-        <w:t>Both algorithms were implemented in Python from standard pseudocode, with a randomized Quick Sort, unit tests, and a benchmark script (see the GitHub repository). Each was run on sorted, reverse-sorted, and random lists of 500 to 8,000 integers; time is the median of five runs (time.perf_counter) and peak extra memory was measured separately with tracemalloc (Gorelick &amp; Ozsvald, 2020) on Python 3.13, Apple Silicon. The core routines are:</w:t>
+        <w:t>Both sorts, a random-pivot Quick Sort, unit tests, and a benchmark script are in the GitHub repository. The benchmark sorts ascending, descending, and random lists of 500 to 8,000 integers, reports the median of five timed runs, and measures peak extra memory in a separate traced run (Gorelick &amp; Ozsvald, 2020), on Python 3.13 and an Apple Silicon Mac. The partition step, which decides Quick Sort’s behavior, is the only routine reproduced here; Figure 1 shows the programs running.</w:t>
       </w:r>
     </w:p>
     <w:p>
@@ -1555,7 +1583,7 @@
           <w:rFonts w:ascii="Courier New" w:hAnsi="Courier New"/>
           <w:sz w:val="19"/>
         </w:rPr>
-        <w:t>def merge(values, low, mid, high):          # condensed from merge_sort.py</w:t>
+        <w:t>def partition(arr, first, last):</w:t>
       </w:r>
     </w:p>
     <w:p>
@@ -1568,7 +1596,7 @@
           <w:rFonts w:ascii="Courier New" w:hAnsi="Courier New"/>
           <w:sz w:val="19"/>
         </w:rPr>
-        <w:t xml:space="preserve">    left, right = values[low:mid + 1], values[mid + 1:high + 1]  # Θ(n) extra space</w:t>
+        <w:t xml:space="preserve">    pivot = arr[last]                        # last item is the pivot</w:t>
       </w:r>
     </w:p>
     <w:p>
@@ -1581,7 +1609,7 @@
           <w:rFonts w:ascii="Courier New" w:hAnsi="Courier New"/>
           <w:sz w:val="19"/>
         </w:rPr>
-        <w:t xml:space="preserve">    i = j = 0</w:t>
+        <w:t xml:space="preserve">    small_end = first - 1                    # arr[first..small_end] &lt;= pivot</w:t>
       </w:r>
     </w:p>
     <w:p>
@@ -1594,7 +1622,7 @@
           <w:rFonts w:ascii="Courier New" w:hAnsi="Courier New"/>
           <w:sz w:val="19"/>
         </w:rPr>
-        <w:t xml:space="preserve">    for k in range(low, high + 1):          # take the smaller front item</w:t>
+        <w:t xml:space="preserve">    for idx in range(first, last):</w:t>
       </w:r>
     </w:p>
     <w:p>
@@ -1607,7 +1635,7 @@
           <w:rFonts w:ascii="Courier New" w:hAnsi="Courier New"/>
           <w:sz w:val="19"/>
         </w:rPr>
-        <w:t xml:space="preserve">        if j == len(right) or (i &lt; len(left) and left[i] &lt;= right[j]):</w:t>
+        <w:t xml:space="preserve">        if arr[idx] &lt;= pivot:</w:t>
       </w:r>
     </w:p>
     <w:p>
@@ -1620,7 +1648,7 @@
           <w:rFonts w:ascii="Courier New" w:hAnsi="Courier New"/>
           <w:sz w:val="19"/>
         </w:rPr>
-        <w:t xml:space="preserve">            values[k] = left[i]; i += 1     # &lt;= keeps the sort stable</w:t>
+        <w:t xml:space="preserve">            small_end += 1</w:t>
       </w:r>
     </w:p>
     <w:p>
@@ -1633,7 +1661,7 @@
           <w:rFonts w:ascii="Courier New" w:hAnsi="Courier New"/>
           <w:sz w:val="19"/>
         </w:rPr>
-        <w:t xml:space="preserve">        else:</w:t>
+        <w:t xml:space="preserve">            arr[small_end], arr[idx] = arr[idx], arr[small_end]</w:t>
       </w:r>
     </w:p>
     <w:p>
@@ -1646,124 +1674,7 @@
           <w:rFonts w:ascii="Courier New" w:hAnsi="Courier New"/>
           <w:sz w:val="19"/>
         </w:rPr>
-        <w:t xml:space="preserve">            values[k] = right[j]; j += 1</w:t>
-      </w:r>
-    </w:p>
-    <w:p>
-      <w:pPr>
-        <w:spacing w:line="240" w:lineRule="auto"/>
-        <w:ind w:left="720"/>
-      </w:pPr>
-      <w:r>
-        <w:rPr>
-          <w:rFonts w:ascii="Courier New" w:hAnsi="Courier New"/>
-          <w:sz w:val="19"/>
-        </w:rPr>
-        <w:t xml:space="preserve"> </w:t>
-      </w:r>
-    </w:p>
-    <w:p>
-      <w:pPr>
-        <w:spacing w:line="240" w:lineRule="auto"/>
-        <w:ind w:left="720"/>
-      </w:pPr>
-      <w:r>
-        <w:rPr>
-          <w:rFonts w:ascii="Courier New" w:hAnsi="Courier New"/>
-          <w:sz w:val="19"/>
-        </w:rPr>
-        <w:t>def partition(values, low, high):</w:t>
-      </w:r>
-    </w:p>
-    <w:p>
-      <w:pPr>
-        <w:spacing w:line="240" w:lineRule="auto"/>
-        <w:ind w:left="720"/>
-      </w:pPr>
-      <w:r>
-        <w:rPr>
-          <w:rFonts w:ascii="Courier New" w:hAnsi="Courier New"/>
-          <w:sz w:val="19"/>
-        </w:rPr>
-        <w:t xml:space="preserve">    pivot = values[high]                    # Lomuto scheme: last item is the pivot</w:t>
-      </w:r>
-    </w:p>
-    <w:p>
-      <w:pPr>
-        <w:spacing w:line="240" w:lineRule="auto"/>
-        <w:ind w:left="720"/>
-      </w:pPr>
-      <w:r>
-        <w:rPr>
-          <w:rFonts w:ascii="Courier New" w:hAnsi="Courier New"/>
-          <w:sz w:val="19"/>
-        </w:rPr>
-        <w:t xml:space="preserve">    boundary = low - 1                      # values[low..boundary] &lt;= pivot</w:t>
-      </w:r>
-    </w:p>
-    <w:p>
-      <w:pPr>
-        <w:spacing w:line="240" w:lineRule="auto"/>
-        <w:ind w:left="720"/>
-      </w:pPr>
-      <w:r>
-        <w:rPr>
-          <w:rFonts w:ascii="Courier New" w:hAnsi="Courier New"/>
-          <w:sz w:val="19"/>
-        </w:rPr>
-        <w:t xml:space="preserve">    for scan in range(low, high):</w:t>
-      </w:r>
-    </w:p>
-    <w:p>
-      <w:pPr>
-        <w:spacing w:line="240" w:lineRule="auto"/>
-        <w:ind w:left="720"/>
-      </w:pPr>
-      <w:r>
-        <w:rPr>
-          <w:rFonts w:ascii="Courier New" w:hAnsi="Courier New"/>
-          <w:sz w:val="19"/>
-        </w:rPr>
-        <w:t xml:space="preserve">        if values[scan] &lt;= pivot:</w:t>
-      </w:r>
-    </w:p>
-    <w:p>
-      <w:pPr>
-        <w:spacing w:line="240" w:lineRule="auto"/>
-        <w:ind w:left="720"/>
-      </w:pPr>
-      <w:r>
-        <w:rPr>
-          <w:rFonts w:ascii="Courier New" w:hAnsi="Courier New"/>
-          <w:sz w:val="19"/>
-        </w:rPr>
-        <w:t xml:space="preserve">            boundary += 1</w:t>
-      </w:r>
-    </w:p>
-    <w:p>
-      <w:pPr>
-        <w:spacing w:line="240" w:lineRule="auto"/>
-        <w:ind w:left="720"/>
-      </w:pPr>
-      <w:r>
-        <w:rPr>
-          <w:rFonts w:ascii="Courier New" w:hAnsi="Courier New"/>
-          <w:sz w:val="19"/>
-        </w:rPr>
-        <w:t xml:space="preserve">            values[boundary], values[scan] = values[scan], values[boundary]</w:t>
-      </w:r>
-    </w:p>
-    <w:p>
-      <w:pPr>
-        <w:spacing w:line="240" w:lineRule="auto"/>
-        <w:ind w:left="720"/>
-      </w:pPr>
-      <w:r>
-        <w:rPr>
-          <w:rFonts w:ascii="Courier New" w:hAnsi="Courier New"/>
-          <w:sz w:val="19"/>
-        </w:rPr>
-        <w:t xml:space="preserve">    values[boundary + 1], values[high] = values[high], values[boundary + 1]</w:t>
+        <w:t xml:space="preserve">    arr[small_end + 1], arr[last] = arr[last], arr[small_end + 1]</w:t>
       </w:r>
     </w:p>
     <w:p>
@@ -1776,7 +1687,69 @@
           <w:rFonts w:ascii="Courier New" w:hAnsi="Courier New"/>
           <w:sz w:val="19"/>
         </w:rPr>
-        <w:t xml:space="preserve">    return boundary + 1</w:t>
+        <w:t xml:space="preserve">    return small_end + 1                     # pivot's final position</w:t>
+      </w:r>
+    </w:p>
+    <w:p>
+      <w:pPr>
+        <w:keepNext/>
+      </w:pPr>
+      <w:r>
+        <w:rPr>
+          <w:b/>
+        </w:rPr>
+        <w:t>Figure 1</w:t>
+      </w:r>
+    </w:p>
+    <w:p>
+      <w:pPr>
+        <w:keepNext/>
+      </w:pPr>
+      <w:r>
+        <w:rPr>
+          <w:i/>
+        </w:rPr>
+        <w:t>Program Execution: Demo Runs, Unit Tests, and Benchmark Output</w:t>
+      </w:r>
+    </w:p>
+    <w:p>
+      <w:pPr>
+        <w:spacing w:line="240" w:lineRule="auto"/>
+        <w:jc w:val="center"/>
+      </w:pPr>
+      <w:r>
+        <w:drawing>
+          <wp:inline xmlns:a="http://schemas.openxmlformats.org/drawingml/2006/main" xmlns:pic="http://schemas.openxmlformats.org/drawingml/2006/picture">
+            <wp:extent cx="3291840" cy="2564052"/>
+            <wp:docPr id="1" name="Picture 1"/>
+            <wp:cNvGraphicFramePr>
+              <a:graphicFrameLocks noChangeAspect="1"/>
+            </wp:cNvGraphicFramePr>
+            <a:graphic>
+              <a:graphicData uri="http://schemas.openxmlformats.org/drawingml/2006/picture">
+                <pic:pic>
+                  <pic:nvPicPr>
+                    <pic:cNvPr id="0" name="execution.png"/>
+                    <pic:cNvPicPr/>
+                  </pic:nvPicPr>
+                  <pic:blipFill>
+                    <a:blip r:embed="rId9"/>
+                    <a:stretch>
+                      <a:fillRect/>
+                    </a:stretch>
+                  </pic:blipFill>
+                  <pic:spPr>
+                    <a:xfrm>
+                      <a:off x="0" y="0"/>
+                      <a:ext cx="3291840" cy="2564052"/>
+                    </a:xfrm>
+                    <a:prstGeom prst="rect"/>
+                  </pic:spPr>
+                </pic:pic>
+              </a:graphicData>
+            </a:graphic>
+          </wp:inline>
+        </w:drawing>
       </w:r>
     </w:p>
     <w:p>
@@ -1952,7 +1925,7 @@
               <w:rPr>
                 <w:sz w:val="22"/>
               </w:rPr>
-              <w:t>6.2</w:t>
+              <w:t>6.3</w:t>
             </w:r>
           </w:p>
         </w:tc>
@@ -1969,7 +1942,7 @@
               <w:rPr>
                 <w:sz w:val="22"/>
               </w:rPr>
-              <w:t>6.2</w:t>
+              <w:t>6.4</w:t>
             </w:r>
           </w:p>
         </w:tc>
@@ -1986,7 +1959,7 @@
               <w:rPr>
                 <w:sz w:val="22"/>
               </w:rPr>
-              <w:t>7.8</w:t>
+              <w:t>8.1</w:t>
             </w:r>
           </w:p>
         </w:tc>
@@ -2039,7 +2012,7 @@
               <w:rPr>
                 <w:sz w:val="22"/>
               </w:rPr>
-              <w:t>1,047.5</w:t>
+              <w:t>1,048.3</w:t>
             </w:r>
           </w:p>
         </w:tc>
@@ -2056,7 +2029,7 @@
               <w:rPr>
                 <w:sz w:val="22"/>
               </w:rPr>
-              <w:t>741.7</w:t>
+              <w:t>735.1</w:t>
             </w:r>
           </w:p>
         </w:tc>
@@ -2073,7 +2046,7 @@
               <w:rPr>
                 <w:sz w:val="22"/>
               </w:rPr>
-              <w:t>4.2</w:t>
+              <w:t>4.1</w:t>
             </w:r>
           </w:p>
         </w:tc>
@@ -2090,7 +2063,7 @@
               <w:rPr>
                 <w:sz w:val="22"/>
               </w:rPr>
-              <w:t>≈ 0.2–0.7 KiB</w:t>
+              <w:t>0.2–0.7 KiB</w:t>
             </w:r>
           </w:p>
         </w:tc>
@@ -2132,7 +2105,7 @@
               <w:rPr>
                 <w:sz w:val="22"/>
               </w:rPr>
-              <w:t>4.9</w:t>
+              <w:t>5.0</w:t>
             </w:r>
           </w:p>
         </w:tc>
@@ -2152,7 +2125,7 @@
               <w:rPr>
                 <w:sz w:val="22"/>
               </w:rPr>
-              <w:t>5.2</w:t>
+              <w:t>5.0</w:t>
             </w:r>
           </w:p>
         </w:tc>
@@ -2192,7 +2165,7 @@
               <w:rPr>
                 <w:sz w:val="22"/>
               </w:rPr>
-              <w:t>≈ 1.0 KiB</w:t>
+              <w:t>1.0–1.1 KiB</w:t>
             </w:r>
           </w:p>
         </w:tc>
@@ -2211,7 +2184,7 @@
         <w:rPr>
           <w:b/>
         </w:rPr>
-        <w:t>Figure 1</w:t>
+        <w:t>Figure 2</w:t>
       </w:r>
     </w:p>
     <w:p>
@@ -2234,7 +2207,7 @@
         <w:drawing>
           <wp:inline xmlns:a="http://schemas.openxmlformats.org/drawingml/2006/main" xmlns:pic="http://schemas.openxmlformats.org/drawingml/2006/picture">
             <wp:extent cx="5943600" cy="1882140"/>
-            <wp:docPr id="1" name="Picture 1"/>
+            <wp:docPr id="2" name="Picture 2"/>
             <wp:cNvGraphicFramePr>
               <a:graphicFrameLocks noChangeAspect="1"/>
             </wp:cNvGraphicFramePr>
@@ -2246,7 +2219,7 @@
                     <pic:cNvPicPr/>
                   </pic:nvPicPr>
                   <pic:blipFill>
-                    <a:blip r:embed="rId9"/>
+                    <a:blip r:embed="rId10"/>
                     <a:stretch>
                       <a:fillRect/>
                     </a:stretch>
@@ -2282,7 +2255,7 @@
           <w:b w:val="0"/>
           <w:i w:val="0"/>
         </w:rPr>
-        <w:t xml:space="preserve">The measurements match the analysis closely. On sorted and reverse-sorted input, each doubling of </w:t>
+        <w:t xml:space="preserve">The timings agree with the analysis. For ascending and descending input, Quick Sort’s time roughly quadrupled each time </w:t>
       </w:r>
       <w:r>
         <w:rPr>
@@ -2296,7 +2269,7 @@
           <w:b w:val="0"/>
           <w:i w:val="0"/>
         </w:rPr>
-        <w:t xml:space="preserve"> multiplied Quick Sort’s time by about 4 (15.2, 62.0, 259.1, 1,047.5 ms), the signature of Θ(</w:t>
+        <w:t xml:space="preserve"> doubled (15.1, 61.9, 257.3, and 1,048.3 ms on sorted input), which is the pattern of a Θ(</w:t>
       </w:r>
       <w:r>
         <w:rPr>
@@ -2310,7 +2283,7 @@
           <w:b w:val="0"/>
           <w:i w:val="0"/>
         </w:rPr>
-        <w:t xml:space="preserve">²); its line in Figure 1 has slope 2, while the other lines have slope just above 1, as expected for </w:t>
+        <w:t xml:space="preserve">²) algorithm; in Figure 2 its line rises with slope 2, while the remaining lines rise with slope slightly above 1, as </w:t>
       </w:r>
       <w:r>
         <w:rPr>
@@ -2338,7 +2311,7 @@
           <w:b w:val="0"/>
           <w:i w:val="0"/>
         </w:rPr>
-        <w:t>. Merge Sort’s time hardly changed with input order, and its memory grew linearly (about 8 bytes per element, one list pointer for each item copied into the merge buffers). Randomizing the pivot removed the dependence on input order entirely.</w:t>
+        <w:t xml:space="preserve"> predicts. Merge Sort’s time barely moved with input order, and its memory grew linearly at about 8 bytes per item, one reference for each element copied into a merge buffer. A random pivot made Quick Sort indifferent to input order.</w:t>
       </w:r>
     </w:p>
     <w:p>
@@ -2350,7 +2323,7 @@
           <w:b w:val="0"/>
           <w:i w:val="0"/>
         </w:rPr>
-        <w:t>Several results differ from what the asymptotic analysis alone predicts. First, on random data the deterministic Quick Sort was almost twice as fast as Merge Sort although both are Θ(</w:t>
+        <w:t>Some observations go beyond what asymptotic bounds can say. On random data the fixed-pivot Quick Sort finished in about half Merge Sort’s time even though both are Θ(</w:t>
       </w:r>
       <w:r>
         <w:rPr>
@@ -2378,7 +2351,7 @@
           <w:b w:val="0"/>
           <w:i w:val="0"/>
         </w:rPr>
-        <w:t xml:space="preserve">): asymptotic notation hides constant factors, and Merge Sort pays for slicing new lists and copying every element at each of lg </w:t>
+        <w:t xml:space="preserve">); the bounds ignore constant factors, and Merge Sort allocates new lists and copies every item on each of its lg </w:t>
       </w:r>
       <w:r>
         <w:rPr>
@@ -2392,7 +2365,7 @@
           <w:b w:val="0"/>
           <w:i w:val="0"/>
         </w:rPr>
-        <w:t xml:space="preserve"> levels, while partitioning swaps in place. Second, Quick Sort was about 40% slower on sorted input than on reverse-sorted input, even though both are worst cases with the same </w:t>
+        <w:t xml:space="preserve"> levels, whereas partitioning only swaps within the list. Quick Sort was also about 40% slower on ascending input than on descending input, although both cases make the same </w:t>
       </w:r>
       <w:r>
         <w:rPr>
@@ -2420,7 +2393,7 @@
           <w:b w:val="0"/>
           <w:i w:val="0"/>
         </w:rPr>
-        <w:t xml:space="preserve"> − 1)/2 comparisons. With sorted input every comparison succeeds and triggers a swap, whereas with reverse-sorted input almost none do, so the comparison count is equal but the work per comparison is not. Third, Merge Sort was about 20% faster on presorted input because one half is exhausted early and the rest is copied without comparisons. Finally, randomized Quick Sort was slightly slower than the deterministic version on random data, since generating a random pivot at every partition is pure overhead when the input is already random. Interpreter overhead inflates all Python timings, but it affects each algorithm similarly, so the relative trends hold. In summary, Merge Sort offers predictable Θ(</w:t>
+        <w:t xml:space="preserve"> − 1)/2 comparisons: with ascending data every comparison succeeds and causes a swap, while with descending data almost none do. Merge Sort ran about 20% faster on presorted input because one half runs out early and the rest is copied without further comparisons. Lastly, the random-pivot version trailed the fixed-pivot one on random data, since drawing a random number at every partition is wasted effort when the data are already shuffled. Python’s interpreter overhead raises every timing, but it does so evenly, so the comparisons remain fair. Overall, Merge Sort trades linear extra memory for dependable Θ(</w:t>
       </w:r>
       <w:r>
         <w:rPr>
@@ -2448,7 +2421,7 @@
           <w:b w:val="0"/>
           <w:i w:val="0"/>
         </w:rPr>
-        <w:t>) time at the cost of linear memory, while Quick Sort is faster and leaner in typical cases but needs a good pivot strategy to avoid its Θ(</w:t>
+        <w:t>) time, while Quick Sort is usually faster and lighter but relies on sensible pivot selection to stay clear of its Θ(</w:t>
       </w:r>
       <w:r>
         <w:rPr>
@@ -2687,7 +2660,7 @@
       </w:r>
     </w:p>
     <w:sectPr>
-      <w:headerReference w:type="default" r:id="rId10"/>
+      <w:headerReference w:type="default" r:id="rId11"/>
       <w:pgSz w:w="12240" w:h="15840"/>
       <w:pgMar w:top="1440" w:right="1440" w:bottom="1440" w:left="1440" w:header="720" w:footer="720" w:gutter="0"/>
       <w:cols w:space="720"/>

</xml_diff>

<commit_message>
Rewrite report in a plainer first-person voice
Co-Authored-By: Claude Opus 5.5 <noreply@anthropic.com>
</commit_message>
<xml_diff>
--- a/MSCS532_Assignment2_Report.docx
+++ b/MSCS532_Assignment2_Report.docx
@@ -133,7 +133,7 @@
           <w:b w:val="0"/>
           <w:i w:val="0"/>
         </w:rPr>
-        <w:t xml:space="preserve">Sorting asks for a list of </w:t>
+        <w:t xml:space="preserve">For this assignment I picked Merge Sort and Quick Sort. Both sort a list of </w:t>
       </w:r>
       <w:r>
         <w:rPr>
@@ -147,7 +147,7 @@
           <w:b w:val="0"/>
           <w:i w:val="0"/>
         </w:rPr>
-        <w:t xml:space="preserve"> keys to be put in nondecreasing order. Merge Sort and Quick Sort both handle it with divide and conquer: break the input into smaller pieces, sort the pieces recursively, and assemble the result. They differ in where the effort goes, and that difference shapes both their guarantees and how they perform in practice.</w:t>
+        <w:t xml:space="preserve"> numbers into increasing order, and both use divide and conquer, but they put the hard work in different places. I wanted to see if that difference shows up when the code actually runs.</w:t>
       </w:r>
     </w:p>
     <w:p>
@@ -167,7 +167,7 @@
           <w:b w:val="0"/>
           <w:i w:val="0"/>
         </w:rPr>
-        <w:t xml:space="preserve">In Merge Sort, splitting is cheap and joining is where the work happens. The algorithm cuts the list at its center, sorts each half by a recursive call, and then merges the two ordered halves by repeatedly moving the smaller of the two leading items into place (Knuth, 1998). A merge of </w:t>
+        <w:t xml:space="preserve">Merge Sort splits the list in the middle, sorts the left half and the right half with recursive calls, and then merges the two sorted halves back together. The merge just keeps comparing the first items of each half and copying the smaller one over (Knuth, 1998). Splitting takes no real effort, and merging </w:t>
       </w:r>
       <w:r>
         <w:rPr>
@@ -195,7 +195,7 @@
           <w:b w:val="0"/>
           <w:i w:val="0"/>
         </w:rPr>
-        <w:t>) time and the halves are always equal in size, so every input produces the same recurrence:</w:t>
+        <w:t>) time. Since the halves are always the same size, the recurrence does not depend on the input at all:</w:t>
       </w:r>
     </w:p>
     <w:p>
@@ -217,16 +217,9 @@
       <w:r>
         <w:rPr>
           <w:b w:val="0"/>
-          <w:i/>
-        </w:rPr>
-        <w:t>Master method.</w:t>
-      </w:r>
-      <w:r>
-        <w:rPr>
-          <w:b w:val="0"/>
           <w:i w:val="0"/>
         </w:rPr>
-        <w:t xml:space="preserve"> With </w:t>
+        <w:t xml:space="preserve">Using the master method, </w:t>
       </w:r>
       <w:r>
         <w:rPr>
@@ -254,7 +247,7 @@
           <w:b w:val="0"/>
           <w:i w:val="0"/>
         </w:rPr>
-        <w:t xml:space="preserve"> = 2, the watershed function is </w:t>
+        <w:t xml:space="preserve"> = 2, so </w:t>
       </w:r>
       <w:r>
         <w:rPr>
@@ -289,7 +282,7 @@
           <w:b w:val="0"/>
           <w:i w:val="0"/>
         </w:rPr>
-        <w:t xml:space="preserve">. Because </w:t>
+        <w:t xml:space="preserve">. The extra work </w:t>
       </w:r>
       <w:r>
         <w:rPr>
@@ -317,7 +310,7 @@
           <w:b w:val="0"/>
           <w:i w:val="0"/>
         </w:rPr>
-        <w:t>) = Θ(</w:t>
+        <w:t>) is Θ(</w:t>
       </w:r>
       <w:r>
         <w:rPr>
@@ -331,7 +324,7 @@
           <w:b w:val="0"/>
           <w:i w:val="0"/>
         </w:rPr>
-        <w:t>) grows at exactly that rate, case 2 gives T(</w:t>
+        <w:t>), the same rate, which puts us in case 2 and gives T(</w:t>
       </w:r>
       <w:r>
         <w:rPr>
@@ -373,21 +366,7 @@
           <w:b w:val="0"/>
           <w:i w:val="0"/>
         </w:rPr>
-        <w:t xml:space="preserve">) (Bentley et al., 1980). </w:t>
-      </w:r>
-      <w:r>
-        <w:rPr>
-          <w:b w:val="0"/>
-          <w:i/>
-        </w:rPr>
-        <w:t>Recursion tree.</w:t>
-      </w:r>
-      <w:r>
-        <w:rPr>
-          <w:b w:val="0"/>
-          <w:i w:val="0"/>
-        </w:rPr>
-        <w:t xml:space="preserve"> The top node costs </w:t>
+        <w:t xml:space="preserve">) (Bentley et al., 1980). The recursion tree gives the same answer in a more visual way. The root costs </w:t>
       </w:r>
       <w:r>
         <w:rPr>
@@ -401,7 +380,21 @@
           <w:b w:val="0"/>
           <w:i w:val="0"/>
         </w:rPr>
-        <w:t xml:space="preserve">. At depth </w:t>
+        <w:t xml:space="preserve">, the next level has two nodes costing </w:t>
+      </w:r>
+      <w:r>
+        <w:rPr>
+          <w:b w:val="0"/>
+          <w:i/>
+        </w:rPr>
+        <w:t>cn</w:t>
+      </w:r>
+      <w:r>
+        <w:rPr>
+          <w:b w:val="0"/>
+          <w:i w:val="0"/>
+        </w:rPr>
+        <w:t xml:space="preserve">/2 each, and in general level </w:t>
       </w:r>
       <w:r>
         <w:rPr>
@@ -415,7 +408,7 @@
           <w:b w:val="0"/>
           <w:i w:val="0"/>
         </w:rPr>
-        <w:t xml:space="preserve"> there are 2</w:t>
+        <w:t xml:space="preserve"> has 2</w:t>
       </w:r>
       <w:r>
         <w:rPr>
@@ -429,14 +422,14 @@
           <w:b w:val="0"/>
           <w:i w:val="0"/>
         </w:rPr>
-        <w:t xml:space="preserve"> subproblems of size </w:t>
+        <w:t xml:space="preserve"> nodes costing </w:t>
       </w:r>
       <w:r>
         <w:rPr>
           <w:b w:val="0"/>
           <w:i/>
         </w:rPr>
-        <w:t>n</w:t>
+        <w:t>cn</w:t>
       </w:r>
       <w:r>
         <w:rPr>
@@ -457,7 +450,7 @@
           <w:b w:val="0"/>
           <w:i w:val="0"/>
         </w:rPr>
-        <w:t xml:space="preserve">, so each depth contributes </w:t>
+        <w:t xml:space="preserve">. Every level adds up to </w:t>
       </w:r>
       <w:r>
         <w:rPr>
@@ -471,7 +464,7 @@
           <w:b w:val="0"/>
           <w:i w:val="0"/>
         </w:rPr>
-        <w:t xml:space="preserve"> in total; over lg </w:t>
+        <w:t xml:space="preserve">, and there are lg </w:t>
       </w:r>
       <w:r>
         <w:rPr>
@@ -485,7 +478,7 @@
           <w:b w:val="0"/>
           <w:i w:val="0"/>
         </w:rPr>
-        <w:t xml:space="preserve"> + 1 depths this sums to </w:t>
+        <w:t xml:space="preserve"> + 1 levels, so the total is </w:t>
       </w:r>
       <w:r>
         <w:rPr>
@@ -527,49 +520,7 @@
           <w:b w:val="0"/>
           <w:i w:val="0"/>
         </w:rPr>
-        <w:t xml:space="preserve"> = Θ(</w:t>
-      </w:r>
-      <w:r>
-        <w:rPr>
-          <w:b w:val="0"/>
-          <w:i/>
-        </w:rPr>
-        <w:t>n</w:t>
-      </w:r>
-      <w:r>
-        <w:rPr>
-          <w:b w:val="0"/>
-          <w:i w:val="0"/>
-        </w:rPr>
-        <w:t xml:space="preserve"> lg </w:t>
-      </w:r>
-      <w:r>
-        <w:rPr>
-          <w:b w:val="0"/>
-          <w:i/>
-        </w:rPr>
-        <w:t>n</w:t>
-      </w:r>
-      <w:r>
-        <w:rPr>
-          <w:b w:val="0"/>
-          <w:i w:val="0"/>
-        </w:rPr>
-        <w:t xml:space="preserve">). </w:t>
-      </w:r>
-      <w:r>
-        <w:rPr>
-          <w:b w:val="0"/>
-          <w:i/>
-        </w:rPr>
-        <w:t>Substitution.</w:t>
-      </w:r>
-      <w:r>
-        <w:rPr>
-          <w:b w:val="0"/>
-          <w:i w:val="0"/>
-        </w:rPr>
-        <w:t xml:space="preserve"> Suppose T(</w:t>
+        <w:t>. To check this with substitution, I assumed T(</w:t>
       </w:r>
       <w:r>
         <w:rPr>
@@ -611,35 +562,7 @@
           <w:b w:val="0"/>
           <w:i w:val="0"/>
         </w:rPr>
-        <w:t xml:space="preserve"> for all </w:t>
-      </w:r>
-      <w:r>
-        <w:rPr>
-          <w:b w:val="0"/>
-          <w:i/>
-        </w:rPr>
-        <w:t>m</w:t>
-      </w:r>
-      <w:r>
-        <w:rPr>
-          <w:b w:val="0"/>
-          <w:i w:val="0"/>
-        </w:rPr>
-        <w:t xml:space="preserve"> &lt; </w:t>
-      </w:r>
-      <w:r>
-        <w:rPr>
-          <w:b w:val="0"/>
-          <w:i/>
-        </w:rPr>
-        <w:t>n</w:t>
-      </w:r>
-      <w:r>
-        <w:rPr>
-          <w:b w:val="0"/>
-          <w:i w:val="0"/>
-        </w:rPr>
-        <w:t>. Then T(</w:t>
+        <w:t xml:space="preserve"> for smaller inputs. Plugging in gives T(</w:t>
       </w:r>
       <w:r>
         <w:rPr>
@@ -779,7 +702,7 @@
           <w:b w:val="0"/>
           <w:i w:val="0"/>
         </w:rPr>
-        <w:t xml:space="preserve">, which is at most </w:t>
+        <w:t xml:space="preserve">, and that is at most </w:t>
       </w:r>
       <w:r>
         <w:rPr>
@@ -807,7 +730,7 @@
           <w:b w:val="0"/>
           <w:i w:val="0"/>
         </w:rPr>
-        <w:t xml:space="preserve"> once </w:t>
+        <w:t xml:space="preserve"> as long as </w:t>
       </w:r>
       <w:r>
         <w:rPr>
@@ -835,7 +758,7 @@
           <w:b w:val="0"/>
           <w:i w:val="0"/>
         </w:rPr>
-        <w:t>; the lower bound is proved the same way. Merge Sort is therefore Θ(</w:t>
+        <w:t>. The lower bound works out the same way. So Merge Sort is Θ(</w:t>
       </w:r>
       <w:r>
         <w:rPr>
@@ -863,7 +786,7 @@
           <w:b w:val="0"/>
           <w:i w:val="0"/>
         </w:rPr>
-        <w:t>), which means O(</w:t>
+        <w:t>), which means it is both O(</w:t>
       </w:r>
       <w:r>
         <w:rPr>
@@ -919,7 +842,7 @@
           <w:b w:val="0"/>
           <w:i w:val="0"/>
         </w:rPr>
-        <w:t>), regardless of whether the input is best, average, or worst case. Its costs are Θ(</w:t>
+        <w:t>), and this holds for the best, average, and worst cases. The downside is the Θ(</w:t>
       </w:r>
       <w:r>
         <w:rPr>
@@ -933,7 +856,7 @@
           <w:b w:val="0"/>
           <w:i w:val="0"/>
         </w:rPr>
-        <w:t>) extra memory for the merge buffers; in exchange it is stable.</w:t>
+        <w:t>) extra memory for the temporary halves. It is also stable.</w:t>
       </w:r>
     </w:p>
     <w:p>
@@ -953,7 +876,7 @@
           <w:b w:val="0"/>
           <w:i w:val="0"/>
         </w:rPr>
-        <w:t>Quick Sort flips this arrangement: dividing is the expensive step and combining costs nothing (Sedgewick, 1978). It picks a pivot (the last item here, following the Lomuto scheme presented by Bentley, 2000), rearranges the list so that keys no larger than the pivot sit to its left and larger keys to its right, and then sorts those two parts recursively. Partitioning is Θ(</w:t>
+        <w:t>Quick Sort does it the other way around (Sedgewick, 1978). It picks a pivot, which in my version is the last item (the Lomuto partition from Bentley, 2000), and moves everything smaller than or equal to the pivot to its left and everything bigger to its right. Then it sorts the two sides recursively, and there is nothing left to combine. Partitioning is Θ(</w:t>
       </w:r>
       <w:r>
         <w:rPr>
@@ -967,7 +890,7 @@
           <w:b w:val="0"/>
           <w:i w:val="0"/>
         </w:rPr>
-        <w:t>), but the sizes of the two parts depend on the pivot, so the recurrence depends on the data:</w:t>
+        <w:t>), but how evenly it splits depends on the pivot, so there are two recurrences to look at:</w:t>
       </w:r>
     </w:p>
     <w:p>
@@ -989,16 +912,9 @@
       <w:r>
         <w:rPr>
           <w:b w:val="0"/>
-          <w:i/>
-        </w:rPr>
-        <w:t>Worst case.</w:t>
-      </w:r>
-      <w:r>
-        <w:rPr>
-          <w:b w:val="0"/>
           <w:i w:val="0"/>
         </w:rPr>
-        <w:t xml:space="preserve"> If every pivot is the smallest or largest key, which is exactly what a last-item pivot meets on ascending or descending input, the recursion tree degenerates into a chain with level costs </w:t>
+        <w:t xml:space="preserve">The worst case happens when the pivot is always the smallest or largest item. With a last-item pivot, that is exactly what happens on a list that is already sorted or sorted backwards. Each call only removes one item, so the recursion tree is a long chain with costs </w:t>
       </w:r>
       <w:r>
         <w:rPr>
@@ -1040,7 +956,7 @@
           <w:b w:val="0"/>
           <w:i w:val="0"/>
         </w:rPr>
-        <w:t xml:space="preserve"> − 1), …, </w:t>
+        <w:t xml:space="preserve"> − 1), and so on down to </w:t>
       </w:r>
       <w:r>
         <w:rPr>
@@ -1054,7 +970,7 @@
           <w:b w:val="0"/>
           <w:i w:val="0"/>
         </w:rPr>
-        <w:t>, totaling Θ(</w:t>
+        <w:t>, which adds up to Θ(</w:t>
       </w:r>
       <w:r>
         <w:rPr>
@@ -1068,7 +984,7 @@
           <w:b w:val="0"/>
           <w:i w:val="0"/>
         </w:rPr>
-        <w:t>²). By substitution, assuming T(</w:t>
+        <w:t>²). For substitution, I assumed T(</w:t>
       </w:r>
       <w:r>
         <w:rPr>
@@ -1096,35 +1012,7 @@
           <w:b w:val="0"/>
           <w:i w:val="0"/>
         </w:rPr>
-        <w:t xml:space="preserve">² for </w:t>
-      </w:r>
-      <w:r>
-        <w:rPr>
-          <w:b w:val="0"/>
-          <w:i/>
-        </w:rPr>
-        <w:t>m</w:t>
-      </w:r>
-      <w:r>
-        <w:rPr>
-          <w:b w:val="0"/>
-          <w:i w:val="0"/>
-        </w:rPr>
-        <w:t xml:space="preserve"> &lt; </w:t>
-      </w:r>
-      <w:r>
-        <w:rPr>
-          <w:b w:val="0"/>
-          <w:i/>
-        </w:rPr>
-        <w:t>n</w:t>
-      </w:r>
-      <w:r>
-        <w:rPr>
-          <w:b w:val="0"/>
-          <w:i w:val="0"/>
-        </w:rPr>
-        <w:t xml:space="preserve"> gives T(</w:t>
+        <w:t>² for smaller inputs and got T(</w:t>
       </w:r>
       <w:r>
         <w:rPr>
@@ -1236,7 +1124,7 @@
           <w:b w:val="0"/>
           <w:i w:val="0"/>
         </w:rPr>
-        <w:t xml:space="preserve">, which stays below </w:t>
+        <w:t xml:space="preserve">, which is at most </w:t>
       </w:r>
       <w:r>
         <w:rPr>
@@ -1250,7 +1138,7 @@
           <w:b w:val="0"/>
           <w:i w:val="0"/>
         </w:rPr>
-        <w:t xml:space="preserve">² for </w:t>
+        <w:t xml:space="preserve">² when </w:t>
       </w:r>
       <w:r>
         <w:rPr>
@@ -1278,7 +1166,7 @@
           <w:b w:val="0"/>
           <w:i w:val="0"/>
         </w:rPr>
-        <w:t xml:space="preserve">. The master method cannot be used here, since the subproblem has size </w:t>
+        <w:t xml:space="preserve">. The master method does not work for this case because the subproblem is size </w:t>
       </w:r>
       <w:r>
         <w:rPr>
@@ -1292,7 +1180,7 @@
           <w:b w:val="0"/>
           <w:i w:val="0"/>
         </w:rPr>
-        <w:t xml:space="preserve"> − 1 rather than </w:t>
+        <w:t xml:space="preserve"> − 1 instead of </w:t>
       </w:r>
       <w:r>
         <w:rPr>
@@ -1320,21 +1208,7 @@
           <w:b w:val="0"/>
           <w:i w:val="0"/>
         </w:rPr>
-        <w:t xml:space="preserve">. </w:t>
-      </w:r>
-      <w:r>
-        <w:rPr>
-          <w:b w:val="0"/>
-          <w:i/>
-        </w:rPr>
-        <w:t>Best and average case.</w:t>
-      </w:r>
-      <w:r>
-        <w:rPr>
-          <w:b w:val="0"/>
-          <w:i w:val="0"/>
-        </w:rPr>
-        <w:t xml:space="preserve"> Balanced splits reproduce the Merge Sort recurrence and give Θ(</w:t>
+        <w:t>. When the splits are even, the recurrence is the same as Merge Sort’s, so case 2 gives Θ(</w:t>
       </w:r>
       <w:r>
         <w:rPr>
@@ -1362,7 +1236,7 @@
           <w:b w:val="0"/>
           <w:i w:val="0"/>
         </w:rPr>
-        <w:t xml:space="preserve">) by master-method case 2. Any fixed proportion, even 9 to 1, still keeps the tree O(log </w:t>
+        <w:t xml:space="preserve">). Even a lopsided split like 9 to 1 still keeps the tree O(log </w:t>
       </w:r>
       <w:r>
         <w:rPr>
@@ -1376,7 +1250,7 @@
           <w:b w:val="0"/>
           <w:i w:val="0"/>
         </w:rPr>
-        <w:t xml:space="preserve">) deep, and a random pivot needs about 1.39 </w:t>
+        <w:t xml:space="preserve">) deep. With a random pivot, Quick Sort makes about 1.39 </w:t>
       </w:r>
       <w:r>
         <w:rPr>
@@ -1404,7 +1278,7 @@
           <w:b w:val="0"/>
           <w:i w:val="0"/>
         </w:rPr>
-        <w:t xml:space="preserve"> comparisons on average (Sedgewick, 1978). In short, Quick Sort is O(</w:t>
+        <w:t xml:space="preserve"> comparisons on average (Sedgewick, 1978). Putting it together, Quick Sort is O(</w:t>
       </w:r>
       <w:r>
         <w:rPr>
@@ -1446,7 +1320,7 @@
           <w:b w:val="0"/>
           <w:i w:val="0"/>
         </w:rPr>
-        <w:t>), with Θ(</w:t>
+        <w:t>). It is Θ(</w:t>
       </w:r>
       <w:r>
         <w:rPr>
@@ -1460,7 +1334,7 @@
           <w:b w:val="0"/>
           <w:i w:val="0"/>
         </w:rPr>
-        <w:t>²) worst-case and Θ(</w:t>
+        <w:t>²) in the worst case and Θ(</w:t>
       </w:r>
       <w:r>
         <w:rPr>
@@ -1488,7 +1362,7 @@
           <w:b w:val="0"/>
           <w:i w:val="0"/>
         </w:rPr>
-        <w:t xml:space="preserve">) best- and expected-case time. It works in place, needs only an O(lg </w:t>
+        <w:t xml:space="preserve">) in the best and expected cases. It sorts in place, uses an O(lg </w:t>
       </w:r>
       <w:r>
         <w:rPr>
@@ -1502,7 +1376,7 @@
           <w:b w:val="0"/>
           <w:i w:val="0"/>
         </w:rPr>
-        <w:t>) stack when the smaller part is handled first, and is not stable.</w:t>
+        <w:t>) stack if the smaller side is sorted first, and is not stable.</w:t>
       </w:r>
     </w:p>
     <w:p>
@@ -1522,7 +1396,7 @@
           <w:b w:val="0"/>
           <w:i w:val="0"/>
         </w:rPr>
-        <w:t>Because Merge Sort never exceeds Θ(</w:t>
+        <w:t>Merge Sort is a good choice when you need a guaranteed running time or a stable sort, for example when sorting records by one field after another. It also reads data in order, which is why it is used for sorting files too big to fit in memory. Python’s own sort, Timsort, is built on merging (Auger et al., 2018). Quick Sort is usually the fastest in memory because it sorts in place with a very simple inner loop. C’s qsort is based on it (Bentley &amp; McIlroy, 1993), and so is C++’s introsort. Library versions choose the pivot more carefully and switch to heapsort if the recursion gets too deep, which rules out the Θ(</w:t>
       </w:r>
       <w:r>
         <w:rPr>
@@ -1536,21 +1410,7 @@
           <w:b w:val="0"/>
           <w:i w:val="0"/>
         </w:rPr>
-        <w:t xml:space="preserve"> lg </w:t>
-      </w:r>
-      <w:r>
-        <w:rPr>
-          <w:b w:val="0"/>
-          <w:i/>
-        </w:rPr>
-        <w:t>n</w:t>
-      </w:r>
-      <w:r>
-        <w:rPr>
-          <w:b w:val="0"/>
-          <w:i w:val="0"/>
-        </w:rPr>
-        <w:t>) and preserves the order of equal keys, it fits applications that need guaranteed response times or multi-key sorting of records. It reads data sequentially, which also makes it the standard approach for external sorting of files larger than memory, and Python’s built-in Timsort is a merge-based hybrid (Auger et al., 2018). Quick Sort’s in-place partitioning and short inner loop usually make it the fastest in-memory comparison sort, which is why C’s qsort (Bentley &amp; McIlroy, 1993) and C++’s introsort rely on it; library versions sample the pivot and switch to heapsort when recursion gets too deep, so the quadratic case never occurs (Musser, 1997).</w:t>
+        <w:t>²) case (Musser, 1997).</w:t>
       </w:r>
     </w:p>
     <w:p>
@@ -1570,7 +1430,7 @@
           <w:b w:val="0"/>
           <w:i w:val="0"/>
         </w:rPr>
-        <w:t>Both sorts, a random-pivot Quick Sort, unit tests, and a benchmark script are in the GitHub repository. The benchmark sorts ascending, descending, and random lists of 500 to 8,000 integers, reports the median of five timed runs, and measures peak extra memory in a separate traced run (Gorelick &amp; Ozsvald, 2020), on Python 3.13 and an Apple Silicon Mac. The partition step, which decides Quick Sort’s behavior, is the only routine reproduced here; Figure 1 shows the programs running.</w:t>
+        <w:t>I wrote both algorithms in Python, plus a version of Quick Sort with a random pivot, some unit tests, and a benchmark script. All of it is in the GitHub repository. The benchmark sorts sorted, reverse-sorted, and random lists from 500 to 8,000 numbers. For time, I took the median of five runs. For memory, I did a separate run using Python’s memory tracing, since tracing slows the code down (Gorelick &amp; Ozsvald, 2020). I ran everything with Python 3.13 on an Apple Silicon Mac. I only included the partition function here, since it is the part that explains Quick Sort’s worst case. Figure 1 shows the programs running.</w:t>
       </w:r>
     </w:p>
     <w:p>
@@ -2206,7 +2066,7 @@
       <w:r>
         <w:drawing>
           <wp:inline xmlns:a="http://schemas.openxmlformats.org/drawingml/2006/main" xmlns:pic="http://schemas.openxmlformats.org/drawingml/2006/picture">
-            <wp:extent cx="5943600" cy="1882140"/>
+            <wp:extent cx="5486400" cy="1737360"/>
             <wp:docPr id="2" name="Picture 2"/>
             <wp:cNvGraphicFramePr>
               <a:graphicFrameLocks noChangeAspect="1"/>
@@ -2227,7 +2087,7 @@
                   <pic:spPr>
                     <a:xfrm>
                       <a:off x="0" y="0"/>
-                      <a:ext cx="5943600" cy="1882140"/>
+                      <a:ext cx="5486400" cy="1737360"/>
                     </a:xfrm>
                     <a:prstGeom prst="rect"/>
                   </pic:spPr>
@@ -2255,7 +2115,7 @@
           <w:b w:val="0"/>
           <w:i w:val="0"/>
         </w:rPr>
-        <w:t xml:space="preserve">The timings agree with the analysis. For ascending and descending input, Quick Sort’s time roughly quadrupled each time </w:t>
+        <w:t xml:space="preserve">Most of the results matched what I expected from the analysis. On sorted and reverse-sorted lists, Quick Sort got about four times slower every time I doubled </w:t>
       </w:r>
       <w:r>
         <w:rPr>
@@ -2269,7 +2129,7 @@
           <w:b w:val="0"/>
           <w:i w:val="0"/>
         </w:rPr>
-        <w:t xml:space="preserve"> doubled (15.1, 61.9, 257.3, and 1,048.3 ms on sorted input), which is the pattern of a Θ(</w:t>
+        <w:t>. On sorted input it went from 15.1 ms to 61.9, 257.3, and finally 1,048.3 ms, which is what Θ(</w:t>
       </w:r>
       <w:r>
         <w:rPr>
@@ -2283,7 +2143,7 @@
           <w:b w:val="0"/>
           <w:i w:val="0"/>
         </w:rPr>
-        <w:t xml:space="preserve">²) algorithm; in Figure 2 its line rises with slope 2, while the remaining lines rise with slope slightly above 1, as </w:t>
+        <w:t xml:space="preserve">²) looks like. In Figure 2 its line has a slope of about 2, while the other lines are just above 1, which fits </w:t>
       </w:r>
       <w:r>
         <w:rPr>
@@ -2311,7 +2171,7 @@
           <w:b w:val="0"/>
           <w:i w:val="0"/>
         </w:rPr>
-        <w:t xml:space="preserve"> predicts. Merge Sort’s time barely moved with input order, and its memory grew linearly at about 8 bytes per item, one reference for each element copied into a merge buffer. A random pivot made Quick Sort indifferent to input order.</w:t>
+        <w:t>. Merge Sort took about the same time no matter how the input was ordered, and its memory grew in a straight line, roughly 8 bytes per item for the copies in the merge step. The random pivot fixed Quick Sort’s problem with sorted input completely.</w:t>
       </w:r>
     </w:p>
     <w:p>
@@ -2323,7 +2183,7 @@
           <w:b w:val="0"/>
           <w:i w:val="0"/>
         </w:rPr>
-        <w:t>Some observations go beyond what asymptotic bounds can say. On random data the fixed-pivot Quick Sort finished in about half Merge Sort’s time even though both are Θ(</w:t>
+        <w:t>A few results surprised me at first. On random data, Quick Sort was about twice as fast as Merge Sort, even though both are Θ(</w:t>
       </w:r>
       <w:r>
         <w:rPr>
@@ -2351,21 +2211,7 @@
           <w:b w:val="0"/>
           <w:i w:val="0"/>
         </w:rPr>
-        <w:t xml:space="preserve">); the bounds ignore constant factors, and Merge Sort allocates new lists and copies every item on each of its lg </w:t>
-      </w:r>
-      <w:r>
-        <w:rPr>
-          <w:b w:val="0"/>
-          <w:i/>
-        </w:rPr>
-        <w:t>n</w:t>
-      </w:r>
-      <w:r>
-        <w:rPr>
-          <w:b w:val="0"/>
-          <w:i w:val="0"/>
-        </w:rPr>
-        <w:t xml:space="preserve"> levels, whereas partitioning only swaps within the list. Quick Sort was also about 40% slower on ascending input than on descending input, although both cases make the same </w:t>
+        <w:t xml:space="preserve">). Big-O notation leaves out constant factors, and Merge Sort spends a lot of time creating new lists and copying items at every level, while Quick Sort only swaps items inside the same list. I also did not expect Quick Sort to be about 40% slower on sorted input than on reverse-sorted input, since both make the same </w:t>
       </w:r>
       <w:r>
         <w:rPr>
@@ -2393,49 +2239,7 @@
           <w:b w:val="0"/>
           <w:i w:val="0"/>
         </w:rPr>
-        <w:t xml:space="preserve"> − 1)/2 comparisons: with ascending data every comparison succeeds and causes a swap, while with descending data almost none do. Merge Sort ran about 20% faster on presorted input because one half runs out early and the rest is copied without further comparisons. Lastly, the random-pivot version trailed the fixed-pivot one on random data, since drawing a random number at every partition is wasted effort when the data are already shuffled. Python’s interpreter overhead raises every timing, but it does so evenly, so the comparisons remain fair. Overall, Merge Sort trades linear extra memory for dependable Θ(</w:t>
-      </w:r>
-      <w:r>
-        <w:rPr>
-          <w:b w:val="0"/>
-          <w:i/>
-        </w:rPr>
-        <w:t>n</w:t>
-      </w:r>
-      <w:r>
-        <w:rPr>
-          <w:b w:val="0"/>
-          <w:i w:val="0"/>
-        </w:rPr>
-        <w:t xml:space="preserve"> lg </w:t>
-      </w:r>
-      <w:r>
-        <w:rPr>
-          <w:b w:val="0"/>
-          <w:i/>
-        </w:rPr>
-        <w:t>n</w:t>
-      </w:r>
-      <w:r>
-        <w:rPr>
-          <w:b w:val="0"/>
-          <w:i w:val="0"/>
-        </w:rPr>
-        <w:t>) time, while Quick Sort is usually faster and lighter but relies on sensible pivot selection to stay clear of its Θ(</w:t>
-      </w:r>
-      <w:r>
-        <w:rPr>
-          <w:b w:val="0"/>
-          <w:i/>
-        </w:rPr>
-        <w:t>n</w:t>
-      </w:r>
-      <w:r>
-        <w:rPr>
-          <w:b w:val="0"/>
-          <w:i w:val="0"/>
-        </w:rPr>
-        <w:t>²) worst case.</w:t>
+        <w:t xml:space="preserve"> − 1)/2 comparisons. Looking at the partition code explained it. On sorted input every comparison is true and leads to a swap, but on reverse-sorted input almost none are. Merge Sort was about 20% faster on sorted input, because one half runs out early and the rest is copied without comparing. Finally, the random-pivot version was a little slower than the normal one on random data. Picking a random number at every step costs time, and it does not help when the data is already random. Python’s overhead slows all three versions about equally, so the comparison is still fair. My takeaway is that Merge Sort is the safer choice when you need predictable time and can spare the memory, while Quick Sort is usually faster but only if the pivot is chosen well.</w:t>
       </w:r>
     </w:p>
     <w:p>

</xml_diff>

<commit_message>
Format report title page and headings per APA 7
Co-Authored-By: Claude Opus 5.5 <noreply@anthropic.com>
</commit_message>
<xml_diff>
--- a/MSCS532_Assignment2_Report.docx
+++ b/MSCS532_Assignment2_Report.docx
@@ -52,6 +52,18 @@
           <w:b w:val="0"/>
           <w:i w:val="0"/>
         </w:rPr>
+        <w:t>PhD in Information Technology, University of the Cumberlands</w:t>
+      </w:r>
+    </w:p>
+    <w:p>
+      <w:pPr>
+        <w:jc w:val="center"/>
+      </w:pPr>
+      <w:r>
+        <w:rPr>
+          <w:b w:val="0"/>
+          <w:i w:val="0"/>
+        </w:rPr>
         <w:t>MSCS 532: Algorithms and Data Structures</w:t>
       </w:r>
     </w:p>
@@ -64,7 +76,7 @@
           <w:b w:val="0"/>
           <w:i w:val="0"/>
         </w:rPr>
-        <w:t>Assignment 2</w:t>
+        <w:t>Michael Solomon</w:t>
       </w:r>
     </w:p>
     <w:p>
@@ -76,7 +88,7 @@
           <w:b w:val="0"/>
           <w:i w:val="0"/>
         </w:rPr>
-        <w:t>University of the Cumberlands</w:t>
+        <w:t>Assignment 2</w:t>
       </w:r>
     </w:p>
     <w:p>
@@ -2949,7 +2961,7 @@
       <w:rFonts w:ascii="Times New Roman" w:hAnsi="Times New Roman"/>
       <w:b/>
       <w:bCs/>
-      <w:i/>
+      <w:i w:val="0"/>
       <w:color w:val="000000"/>
       <w:sz w:val="24"/>
       <w:szCs w:val="26"/>

</xml_diff>

<commit_message>
Remove date from report title page
Co-Authored-By: Claude Opus 5.5 <noreply@anthropic.com>
</commit_message>
<xml_diff>
--- a/MSCS532_Assignment2_Report.docx
+++ b/MSCS532_Assignment2_Report.docx
@@ -89,18 +89,6 @@
           <w:i w:val="0"/>
         </w:rPr>
         <w:t>Assignment 2</w:t>
-      </w:r>
-    </w:p>
-    <w:p>
-      <w:pPr>
-        <w:jc w:val="center"/>
-      </w:pPr>
-      <w:r>
-        <w:rPr>
-          <w:b w:val="0"/>
-          <w:i w:val="0"/>
-        </w:rPr>
-        <w:t>October 28, 2026</w:t>
       </w:r>
     </w:p>
     <w:p>

</xml_diff>